<commit_message>
code report part - basics
</commit_message>
<xml_diff>
--- a/Report-1.docx
+++ b/Report-1.docx
@@ -2,48 +2,6 @@
 <file path=word/document.xml><?xml version="1.0" encoding="utf-8"?>
 <w:document xmlns:wpc="http://schemas.microsoft.com/office/word/2010/wordprocessingCanvas" xmlns:mc="http://schemas.openxmlformats.org/markup-compatibility/2006" xmlns:o="urn:schemas-microsoft-com:office:office" xmlns:r="http://schemas.openxmlformats.org/officeDocument/2006/relationships" xmlns:m="http://schemas.openxmlformats.org/officeDocument/2006/math" xmlns:v="urn:schemas-microsoft-com:vml" xmlns:wp="http://schemas.openxmlformats.org/drawingml/2006/wordprocessingDrawing" xmlns:w="http://schemas.openxmlformats.org/wordprocessingml/2006/main" xmlns:wpg="http://schemas.microsoft.com/office/word/2010/wordprocessingGroup" xmlns:wpi="http://schemas.microsoft.com/office/word/2010/wordprocessingInk" xmlns:a="http://schemas.openxmlformats.org/drawingml/2006/main" xmlns:wne="http://schemas.microsoft.com/office/word/2006/wordml" xmlns:wps="http://schemas.microsoft.com/office/word/2010/wordprocessingShape" xmlns:w10="urn:schemas-microsoft-com:office:word" xmlns:wp14="http://schemas.microsoft.com/office/word/2010/wordprocessingDrawing" xmlns:w14="http://schemas.microsoft.com/office/word/2010/wordml" xmlns:w15="http://schemas.microsoft.com/office/word/2012/wordml" xmlns:w16cex="http://schemas.microsoft.com/office/word/2018/wordml/cex" xmlns:w16cid="http://schemas.microsoft.com/office/word/2016/wordml/cid" xmlns:w16="http://schemas.microsoft.com/office/word/2018/wordml" xmlns:w16sdtdh="http://schemas.microsoft.com/office/word/2020/wordml/sdtdatahash" xmlns:w16se="http://schemas.microsoft.com/office/word/2015/wordml/symex" mc:Ignorable="w14 w15 w16se w16cid w16 w16cex w16sdtdh wp14">
   <w:body>
-    <w:p>
-      <w:pPr>
-        <w:pBdr>
-          <w:top w:val="none" w:color="000000" w:sz="4" w:space="0"/>
-          <w:left w:val="none" w:color="000000" w:sz="4" w:space="0"/>
-          <w:bottom w:val="none" w:color="000000" w:sz="4" w:space="0"/>
-          <w:right w:val="none" w:color="000000" w:sz="4" w:space="0"/>
-        </w:pBdr>
-        <w:spacing/>
-        <w:ind w:right="0" w:firstLine="0" w:left="0"/>
-        <w:rPr>
-          <w:rFonts w:ascii="Open Sans" w:hAnsi="Open Sans" w:cs="Open Sans"/>
-          <w:sz w:val="20"/>
-          <w:szCs w:val="20"/>
-        </w:rPr>
-      </w:pPr>
-      <w:r>
-        <w:rPr>
-          <w:rFonts w:ascii="Open Sans" w:hAnsi="Open Sans" w:eastAsia="Open Sans" w:cs="Open Sans"/>
-          <w:color w:val="000000"/>
-          <w:sz w:val="20"/>
-          <w:szCs w:val="20"/>
-        </w:rPr>
-        <w:t xml:space="preserve">A continuación, se presenta un informe detallado que abarca todos los pasos realizados en el proyecto, explicado con un lenguaje sencillo y accesible. Este reporte está organizado en secciones para facilitar la comprensión de cada etapa y los análisis efec</w:t>
-      </w:r>
-      <w:r>
-        <w:rPr>
-          <w:rFonts w:ascii="Open Sans" w:hAnsi="Open Sans" w:eastAsia="Open Sans" w:cs="Open Sans"/>
-          <w:color w:val="000000"/>
-          <w:sz w:val="20"/>
-          <w:szCs w:val="20"/>
-        </w:rPr>
-        <w:t xml:space="preserve">tuados.</w:t>
-      </w:r>
-      <w:r>
-        <w:rPr>
-          <w:rFonts w:ascii="Open Sans" w:hAnsi="Open Sans" w:eastAsia="Open Sans" w:cs="Open Sans"/>
-          <w:sz w:val="20"/>
-          <w:szCs w:val="20"/>
-        </w:rPr>
-      </w:r>
-    </w:p>
     <w:p>
       <w:pPr>
         <w:pStyle w:val="138"/>
@@ -104,7 +62,27 @@
           <w:sz w:val="20"/>
           <w:szCs w:val="20"/>
         </w:rPr>
-        <w:t xml:space="preserve">1. Introducción</w:t>
+        <w:t xml:space="preserve">1. Introducción y presentaci</w:t>
+      </w:r>
+      <w:r>
+        <w:rPr>
+          <w:rFonts w:ascii="Open Sans" w:hAnsi="Open Sans" w:eastAsia="Open Sans" w:cs="Open Sans"/>
+          <w:b/>
+          <w:color w:val="000000"/>
+          <w:sz w:val="20"/>
+          <w:szCs w:val="20"/>
+        </w:rPr>
+        <w:t xml:space="preserve">ó</w:t>
+      </w:r>
+      <w:r>
+        <w:rPr>
+          <w:rFonts w:ascii="Open Sans" w:hAnsi="Open Sans" w:eastAsia="Open Sans" w:cs="Open Sans"/>
+          <w:b/>
+          <w:color w:val="000000"/>
+          <w:sz w:val="20"/>
+          <w:szCs w:val="20"/>
+        </w:rPr>
+        <w:t xml:space="preserve">n</w:t>
       </w:r>
       <w:r>
         <w:rPr>
@@ -116,6 +94,47 @@
     </w:p>
     <w:p>
       <w:pPr>
+        <w:pStyle w:val="139"/>
+        <w:pBdr>
+          <w:top w:val="none" w:color="000000" w:sz="4" w:space="0"/>
+          <w:left w:val="none" w:color="000000" w:sz="4" w:space="0"/>
+          <w:bottom w:val="none" w:color="000000" w:sz="4" w:space="0"/>
+          <w:right w:val="none" w:color="000000" w:sz="4" w:space="0"/>
+        </w:pBdr>
+        <w:spacing/>
+        <w:ind w:right="0" w:firstLine="0" w:left="0"/>
+        <w:rPr>
+          <w:rFonts w:ascii="Open Sans" w:hAnsi="Open Sans" w:cs="Open Sans"/>
+          <w:sz w:val="20"/>
+          <w:szCs w:val="20"/>
+        </w:rPr>
+      </w:pPr>
+      <w:r>
+        <w:rPr>
+          <w:rFonts w:ascii="Open Sans" w:hAnsi="Open Sans" w:eastAsia="Open Sans" w:cs="Open Sans"/>
+          <w:b/>
+          <w:color w:val="000000"/>
+          <w:sz w:val="20"/>
+          <w:szCs w:val="20"/>
+        </w:rPr>
+      </w:r>
+      <w:r>
+        <w:rPr>
+          <w:rFonts w:ascii="Open Sans" w:hAnsi="Open Sans" w:cs="Open Sans"/>
+          <w:sz w:val="20"/>
+          <w:szCs w:val="20"/>
+        </w:rPr>
+      </w:r>
+      <w:r>
+        <w:rPr>
+          <w:rFonts w:ascii="Open Sans" w:hAnsi="Open Sans" w:cs="Open Sans"/>
+          <w:sz w:val="20"/>
+          <w:szCs w:val="20"/>
+        </w:rPr>
+      </w:r>
+    </w:p>
+    <w:p>
+      <w:pPr>
         <w:pBdr>
           <w:top w:val="none" w:color="000000" w:sz="4" w:space="0"/>
           <w:left w:val="none" w:color="000000" w:sz="4" w:space="0"/>
@@ -137,7 +156,7 @@
           <w:sz w:val="20"/>
           <w:szCs w:val="20"/>
         </w:rPr>
-        <w:t xml:space="preserve">El objetivo de este proyecto es desarrollar un modelo de red neuronal convolucional (CNN) que sea capaz de clasificar imágenes de frutas en seis categorías: tres correspondientes a frutas frescas (manzanas, bananas y naranjas) y tres a frutas podridas. El </w:t>
+        <w:t xml:space="preserve">Este proyecto tiene como objetivo aplicar los conocimientos adquiridos durante el curso de PyTorch para abordar diferentes desafíos en el análisis de imágenes, avanzando progresivamente desde tareas básicas de clasificación hasta aplicaciones más complejas</w:t>
       </w:r>
       <w:r>
         <w:rPr>
@@ -146,12 +165,52 @@
           <w:sz w:val="20"/>
           <w:szCs w:val="20"/>
         </w:rPr>
-        <w:t xml:space="preserve">dataset utilizado, denominado </w:t>
+        <w:t xml:space="preserve"> y realistas.</w:t>
+      </w:r>
+      <w:r>
+        <w:rPr>
+          <w:rFonts w:ascii="Open Sans" w:hAnsi="Open Sans" w:cs="Open Sans"/>
+          <w:sz w:val="20"/>
+          <w:szCs w:val="20"/>
+        </w:rPr>
+      </w:r>
+      <w:r>
+        <w:rPr>
+          <w:rFonts w:ascii="Open Sans" w:hAnsi="Open Sans" w:cs="Open Sans"/>
+          <w:sz w:val="20"/>
+          <w:szCs w:val="20"/>
+        </w:rPr>
+      </w:r>
+    </w:p>
+    <w:p>
+      <w:pPr>
+        <w:pBdr>
+          <w:top w:val="none" w:color="000000" w:sz="4" w:space="0"/>
+          <w:left w:val="none" w:color="000000" w:sz="4" w:space="0"/>
+          <w:bottom w:val="none" w:color="000000" w:sz="4" w:space="0"/>
+          <w:right w:val="none" w:color="000000" w:sz="4" w:space="0"/>
+        </w:pBdr>
+        <w:spacing/>
+        <w:ind w:right="0" w:firstLine="0" w:left="0"/>
+        <w:rPr>
+          <w:rFonts w:ascii="Open Sans" w:hAnsi="Open Sans" w:cs="Open Sans"/>
+          <w:sz w:val="20"/>
+          <w:szCs w:val="20"/>
+        </w:rPr>
+      </w:pPr>
+      <w:r>
+        <w:rPr>
+          <w:rFonts w:ascii="Open Sans" w:hAnsi="Open Sans" w:eastAsia="Open Sans" w:cs="Open Sans"/>
+          <w:color w:val="000000"/>
+          <w:sz w:val="20"/>
+          <w:szCs w:val="20"/>
+        </w:rPr>
+        <w:t xml:space="preserve">En una primera etapa, se trabajó con el dataset </w:t>
       </w:r>
       <w:r>
         <w:rPr>
           <w:rFonts w:ascii="Open Sans" w:hAnsi="Open Sans" w:eastAsia="Open Sans" w:cs="Open Sans"/>
-          <w:i/>
+          <w:b/>
           <w:color w:val="000000"/>
           <w:sz w:val="20"/>
           <w:szCs w:val="20"/>
@@ -165,7 +224,521 @@
           <w:sz w:val="20"/>
           <w:szCs w:val="20"/>
         </w:rPr>
-        <w:t xml:space="preserve">, cuenta con una organización en carpetas para datos de entrenamiento y de prueba. Este informe describe paso a paso el proceso seguido, desde el preprocesamiento de los datos hasta la evaluación y documentación de los resultados.</w:t>
+        <w:t xml:space="preserve">, compuesto por imágenes de frutas clasificadas en seis categorías: manzanas, bananas y naranjas, tanto en estado fresco como podrido. Este conjunto de datos está organizado en carpetas separadas para entrenamiento y prueba. Utilizando este dataset, se ent</w:t>
+      </w:r>
+      <w:r>
+        <w:rPr>
+          <w:rFonts w:ascii="Open Sans" w:hAnsi="Open Sans" w:eastAsia="Open Sans" w:cs="Open Sans"/>
+          <w:color w:val="000000"/>
+          <w:sz w:val="20"/>
+          <w:szCs w:val="20"/>
+        </w:rPr>
+        <w:t xml:space="preserve">renó una red neuronal convolucional (CNN) desde cero, con el fin de desarrollar un modelo capaz de distinguir entre las diferentes clases de frutas. Esta fase incluyó el preprocesamiento de datos, el diseño del modelo, el entrenamiento, la evaluación y la </w:t>
+      </w:r>
+      <w:r>
+        <w:rPr>
+          <w:rFonts w:ascii="Open Sans" w:hAnsi="Open Sans" w:eastAsia="Open Sans" w:cs="Open Sans"/>
+          <w:color w:val="000000"/>
+          <w:sz w:val="20"/>
+          <w:szCs w:val="20"/>
+        </w:rPr>
+        <w:t xml:space="preserve">visualización de resultados.</w:t>
+      </w:r>
+      <w:r>
+        <w:rPr>
+          <w:rFonts w:ascii="Open Sans" w:hAnsi="Open Sans" w:cs="Open Sans"/>
+          <w:sz w:val="20"/>
+          <w:szCs w:val="20"/>
+        </w:rPr>
+      </w:r>
+      <w:r>
+        <w:rPr>
+          <w:rFonts w:ascii="Open Sans" w:hAnsi="Open Sans" w:cs="Open Sans"/>
+          <w:sz w:val="20"/>
+          <w:szCs w:val="20"/>
+        </w:rPr>
+      </w:r>
+    </w:p>
+    <w:p>
+      <w:pPr>
+        <w:pBdr>
+          <w:top w:val="none" w:color="000000" w:sz="4" w:space="0"/>
+          <w:left w:val="none" w:color="000000" w:sz="4" w:space="0"/>
+          <w:bottom w:val="none" w:color="000000" w:sz="4" w:space="0"/>
+          <w:right w:val="none" w:color="000000" w:sz="4" w:space="0"/>
+        </w:pBdr>
+        <w:spacing/>
+        <w:ind w:right="0" w:firstLine="0" w:left="0"/>
+        <w:rPr>
+          <w:rFonts w:ascii="Open Sans" w:hAnsi="Open Sans" w:cs="Open Sans"/>
+          <w:sz w:val="20"/>
+          <w:szCs w:val="20"/>
+        </w:rPr>
+      </w:pPr>
+      <w:r>
+        <w:rPr>
+          <w:rFonts w:ascii="Open Sans" w:hAnsi="Open Sans" w:eastAsia="Open Sans" w:cs="Open Sans"/>
+          <w:color w:val="000000"/>
+          <w:sz w:val="20"/>
+          <w:szCs w:val="20"/>
+        </w:rPr>
+        <w:t xml:space="preserve">Posteriormente, con el propósito de profundizar en el análisis de imágenes y aplicar técnicas más avanzadas vistas durante el curso, se utilizó un modelo </w:t>
+      </w:r>
+      <w:r>
+        <w:rPr>
+          <w:rFonts w:ascii="Open Sans" w:hAnsi="Open Sans" w:eastAsia="Open Sans" w:cs="Open Sans"/>
+          <w:b/>
+          <w:color w:val="000000"/>
+          <w:sz w:val="20"/>
+          <w:szCs w:val="20"/>
+        </w:rPr>
+        <w:t xml:space="preserve">preentrenado</w:t>
+      </w:r>
+      <w:r>
+        <w:rPr>
+          <w:rFonts w:ascii="Open Sans" w:hAnsi="Open Sans" w:eastAsia="Open Sans" w:cs="Open Sans"/>
+          <w:color w:val="000000"/>
+          <w:sz w:val="20"/>
+          <w:szCs w:val="20"/>
+        </w:rPr>
+        <w:t xml:space="preserve"> adaptado con </w:t>
+      </w:r>
+      <w:r>
+        <w:rPr>
+          <w:rFonts w:ascii="Open Sans" w:hAnsi="Open Sans" w:eastAsia="Open Sans" w:cs="Open Sans"/>
+          <w:b/>
+          <w:color w:val="000000"/>
+          <w:sz w:val="20"/>
+          <w:szCs w:val="20"/>
+        </w:rPr>
+        <w:t xml:space="preserve">EfficientNet</w:t>
+      </w:r>
+      <w:r>
+        <w:rPr>
+          <w:rFonts w:ascii="Open Sans" w:hAnsi="Open Sans" w:eastAsia="Open Sans" w:cs="Open Sans"/>
+          <w:color w:val="000000"/>
+          <w:sz w:val="20"/>
+          <w:szCs w:val="20"/>
+        </w:rPr>
+        <w:t xml:space="preserve">. Este modelo fue ajustado para clasificar las mismas seis clases del dataset de frutas. Además, se añadió la funcionalidad de analizar imágenes externas, y se incorporó </w:t>
+      </w:r>
+      <w:r>
+        <w:rPr>
+          <w:rFonts w:ascii="Open Sans" w:hAnsi="Open Sans" w:eastAsia="Open Sans" w:cs="Open Sans"/>
+          <w:b/>
+          <w:color w:val="000000"/>
+          <w:sz w:val="20"/>
+          <w:szCs w:val="20"/>
+        </w:rPr>
+        <w:t xml:space="preserve">Grad-CAM</w:t>
+      </w:r>
+      <w:r>
+        <w:rPr>
+          <w:rFonts w:ascii="Open Sans" w:hAnsi="Open Sans" w:eastAsia="Open Sans" w:cs="Open Sans"/>
+          <w:color w:val="000000"/>
+          <w:sz w:val="20"/>
+          <w:szCs w:val="20"/>
+        </w:rPr>
+        <w:t xml:space="preserve"> como técnica de visualización para interpretar en qué regiones de la imagen se enfocaba el modelo al tomar sus decisiones.</w:t>
+      </w:r>
+      <w:r>
+        <w:rPr>
+          <w:rFonts w:ascii="Open Sans" w:hAnsi="Open Sans" w:cs="Open Sans"/>
+          <w:sz w:val="20"/>
+          <w:szCs w:val="20"/>
+        </w:rPr>
+      </w:r>
+      <w:r>
+        <w:rPr>
+          <w:rFonts w:ascii="Open Sans" w:hAnsi="Open Sans" w:cs="Open Sans"/>
+          <w:sz w:val="20"/>
+          <w:szCs w:val="20"/>
+        </w:rPr>
+      </w:r>
+    </w:p>
+    <w:p>
+      <w:pPr>
+        <w:pBdr>
+          <w:top w:val="none" w:color="000000" w:sz="4" w:space="0"/>
+          <w:left w:val="none" w:color="000000" w:sz="4" w:space="0"/>
+          <w:bottom w:val="none" w:color="000000" w:sz="4" w:space="0"/>
+          <w:right w:val="none" w:color="000000" w:sz="4" w:space="0"/>
+        </w:pBdr>
+        <w:spacing/>
+        <w:ind w:right="0" w:firstLine="0" w:left="0"/>
+        <w:rPr>
+          <w:rFonts w:ascii="Open Sans" w:hAnsi="Open Sans" w:cs="Open Sans"/>
+          <w:sz w:val="20"/>
+          <w:szCs w:val="20"/>
+        </w:rPr>
+      </w:pPr>
+      <w:r>
+        <w:rPr>
+          <w:rFonts w:ascii="Open Sans" w:hAnsi="Open Sans" w:eastAsia="Open Sans" w:cs="Open Sans"/>
+          <w:color w:val="000000"/>
+          <w:sz w:val="20"/>
+          <w:szCs w:val="20"/>
+        </w:rPr>
+        <w:t xml:space="preserve">Avanzando en complejidad, se implementó un modelo </w:t>
+      </w:r>
+      <w:r>
+        <w:rPr>
+          <w:rFonts w:ascii="Open Sans" w:hAnsi="Open Sans" w:eastAsia="Open Sans" w:cs="Open Sans"/>
+          <w:b/>
+          <w:color w:val="000000"/>
+          <w:sz w:val="20"/>
+          <w:szCs w:val="20"/>
+        </w:rPr>
+        <w:t xml:space="preserve">DETR (DEtection TRansformer)</w:t>
+      </w:r>
+      <w:r>
+        <w:rPr>
+          <w:rFonts w:ascii="Open Sans" w:hAnsi="Open Sans" w:eastAsia="Open Sans" w:cs="Open Sans"/>
+          <w:color w:val="000000"/>
+          <w:sz w:val="20"/>
+          <w:szCs w:val="20"/>
+        </w:rPr>
+        <w:t xml:space="preserve"> apoyado por una red </w:t>
+      </w:r>
+      <w:r>
+        <w:rPr>
+          <w:rFonts w:ascii="Open Sans" w:hAnsi="Open Sans" w:eastAsia="Open Sans" w:cs="Open Sans"/>
+          <w:b/>
+          <w:color w:val="000000"/>
+          <w:sz w:val="20"/>
+          <w:szCs w:val="20"/>
+        </w:rPr>
+        <w:t xml:space="preserve">ResNet-50</w:t>
+      </w:r>
+      <w:r>
+        <w:rPr>
+          <w:rFonts w:ascii="Open Sans" w:hAnsi="Open Sans" w:eastAsia="Open Sans" w:cs="Open Sans"/>
+          <w:color w:val="000000"/>
+          <w:sz w:val="20"/>
+          <w:szCs w:val="20"/>
+        </w:rPr>
+        <w:t xml:space="preserve">, entrenado con las clases del conjunto </w:t>
+      </w:r>
+      <w:r>
+        <w:rPr>
+          <w:rFonts w:ascii="Open Sans" w:hAnsi="Open Sans" w:eastAsia="Open Sans" w:cs="Open Sans"/>
+          <w:b/>
+          <w:color w:val="000000"/>
+          <w:sz w:val="20"/>
+          <w:szCs w:val="20"/>
+        </w:rPr>
+        <w:t xml:space="preserve">COCO</w:t>
+      </w:r>
+      <w:r>
+        <w:rPr>
+          <w:rFonts w:ascii="Open Sans" w:hAnsi="Open Sans" w:eastAsia="Open Sans" w:cs="Open Sans"/>
+          <w:color w:val="000000"/>
+          <w:sz w:val="20"/>
+          <w:szCs w:val="20"/>
+        </w:rPr>
+        <w:t xml:space="preserve">, para realizar tareas de detección de objetos en imágenes. Esta herramienta nos permitió no solo clasificar, sino también localizar visualmente objetos dentro de una imagen.</w:t>
+      </w:r>
+      <w:r>
+        <w:rPr>
+          <w:rFonts w:ascii="Open Sans" w:hAnsi="Open Sans" w:cs="Open Sans"/>
+          <w:sz w:val="20"/>
+          <w:szCs w:val="20"/>
+        </w:rPr>
+      </w:r>
+      <w:r>
+        <w:rPr>
+          <w:rFonts w:ascii="Open Sans" w:hAnsi="Open Sans" w:cs="Open Sans"/>
+          <w:sz w:val="20"/>
+          <w:szCs w:val="20"/>
+        </w:rPr>
+      </w:r>
+    </w:p>
+    <w:p>
+      <w:pPr>
+        <w:pBdr>
+          <w:top w:val="none" w:color="000000" w:sz="4" w:space="0"/>
+          <w:left w:val="none" w:color="000000" w:sz="4" w:space="0"/>
+          <w:bottom w:val="none" w:color="000000" w:sz="4" w:space="0"/>
+          <w:right w:val="none" w:color="000000" w:sz="4" w:space="0"/>
+        </w:pBdr>
+        <w:spacing/>
+        <w:ind w:right="0" w:firstLine="0" w:left="0"/>
+        <w:rPr>
+          <w:rFonts w:ascii="Open Sans" w:hAnsi="Open Sans" w:cs="Open Sans"/>
+          <w:sz w:val="20"/>
+          <w:szCs w:val="20"/>
+        </w:rPr>
+      </w:pPr>
+      <w:r>
+        <w:rPr>
+          <w:rFonts w:ascii="Open Sans" w:hAnsi="Open Sans" w:eastAsia="Open Sans" w:cs="Open Sans"/>
+          <w:color w:val="000000"/>
+          <w:sz w:val="20"/>
+          <w:szCs w:val="20"/>
+        </w:rPr>
+        <w:t xml:space="preserve">Con este conocimiento, se aplicó el modelo a la detección de objetos en </w:t>
+      </w:r>
+      <w:r>
+        <w:rPr>
+          <w:rFonts w:ascii="Open Sans" w:hAnsi="Open Sans" w:eastAsia="Open Sans" w:cs="Open Sans"/>
+          <w:b/>
+          <w:color w:val="000000"/>
+          <w:sz w:val="20"/>
+          <w:szCs w:val="20"/>
+        </w:rPr>
+        <w:t xml:space="preserve">videos</w:t>
+      </w:r>
+      <w:r>
+        <w:rPr>
+          <w:rFonts w:ascii="Open Sans" w:hAnsi="Open Sans" w:eastAsia="Open Sans" w:cs="Open Sans"/>
+          <w:color w:val="000000"/>
+          <w:sz w:val="20"/>
+          <w:szCs w:val="20"/>
+        </w:rPr>
+        <w:t xml:space="preserve">, lo cual representa un paso importante hacia aplicaciones prácticas más dinámicas y exigentes.</w:t>
+      </w:r>
+      <w:r>
+        <w:rPr>
+          <w:rFonts w:ascii="Open Sans" w:hAnsi="Open Sans" w:cs="Open Sans"/>
+          <w:sz w:val="20"/>
+          <w:szCs w:val="20"/>
+        </w:rPr>
+      </w:r>
+      <w:r>
+        <w:rPr>
+          <w:rFonts w:ascii="Open Sans" w:hAnsi="Open Sans" w:cs="Open Sans"/>
+          <w:sz w:val="20"/>
+          <w:szCs w:val="20"/>
+        </w:rPr>
+      </w:r>
+    </w:p>
+    <w:p>
+      <w:pPr>
+        <w:pBdr>
+          <w:top w:val="none" w:color="000000" w:sz="4" w:space="0"/>
+          <w:left w:val="none" w:color="000000" w:sz="4" w:space="0"/>
+          <w:bottom w:val="none" w:color="000000" w:sz="4" w:space="0"/>
+          <w:right w:val="none" w:color="000000" w:sz="4" w:space="0"/>
+        </w:pBdr>
+        <w:spacing/>
+        <w:ind w:right="0" w:firstLine="0" w:left="0"/>
+        <w:rPr>
+          <w:rFonts w:ascii="Open Sans" w:hAnsi="Open Sans" w:cs="Open Sans"/>
+          <w:sz w:val="20"/>
+          <w:szCs w:val="20"/>
+        </w:rPr>
+      </w:pPr>
+      <w:r>
+        <w:rPr>
+          <w:rFonts w:ascii="Open Sans" w:hAnsi="Open Sans" w:eastAsia="Open Sans" w:cs="Open Sans"/>
+          <w:color w:val="000000"/>
+          <w:sz w:val="20"/>
+          <w:szCs w:val="20"/>
+        </w:rPr>
+        <w:t xml:space="preserve">Finalmente, comentamos  sobre una posible implementación en la vida real: la integración de estos modelos en sistemas de </w:t>
+      </w:r>
+      <w:r>
+        <w:rPr>
+          <w:rFonts w:ascii="Open Sans" w:hAnsi="Open Sans" w:eastAsia="Open Sans" w:cs="Open Sans"/>
+          <w:b/>
+          <w:color w:val="000000"/>
+          <w:sz w:val="20"/>
+          <w:szCs w:val="20"/>
+        </w:rPr>
+        <w:t xml:space="preserve">visión artificial para robots o máquinas</w:t>
+      </w:r>
+      <w:r>
+        <w:rPr>
+          <w:rFonts w:ascii="Open Sans" w:hAnsi="Open Sans" w:eastAsia="Open Sans" w:cs="Open Sans"/>
+          <w:color w:val="000000"/>
+          <w:sz w:val="20"/>
+          <w:szCs w:val="20"/>
+        </w:rPr>
+        <w:t xml:space="preserve">, permitiendo que puedan interpretar su entorno a partir de imágenes en tiempo real. Esta capacidad de análisis visual abre la puerta a aplicaciones en automatización, agricultura, manufactura y más.</w:t>
+      </w:r>
+      <w:r>
+        <w:rPr>
+          <w:rFonts w:ascii="Open Sans" w:hAnsi="Open Sans" w:cs="Open Sans"/>
+          <w:sz w:val="20"/>
+          <w:szCs w:val="20"/>
+        </w:rPr>
+      </w:r>
+      <w:r>
+        <w:rPr>
+          <w:rFonts w:ascii="Open Sans" w:hAnsi="Open Sans" w:cs="Open Sans"/>
+          <w:sz w:val="20"/>
+          <w:szCs w:val="20"/>
+        </w:rPr>
+      </w:r>
+    </w:p>
+    <w:p>
+      <w:pPr>
+        <w:pBdr>
+          <w:top w:val="none" w:color="000000" w:sz="4" w:space="0"/>
+          <w:left w:val="none" w:color="000000" w:sz="4" w:space="0"/>
+          <w:bottom w:val="none" w:color="000000" w:sz="4" w:space="0"/>
+          <w:right w:val="none" w:color="000000" w:sz="4" w:space="0"/>
+        </w:pBdr>
+        <w:spacing/>
+        <w:ind w:right="0" w:firstLine="0" w:left="0"/>
+        <w:rPr>
+          <w:rFonts w:ascii="Open Sans" w:hAnsi="Open Sans" w:cs="Open Sans"/>
+          <w:sz w:val="20"/>
+          <w:szCs w:val="20"/>
+        </w:rPr>
+      </w:pPr>
+      <w:r>
+        <w:rPr>
+          <w:rFonts w:ascii="Open Sans" w:hAnsi="Open Sans" w:eastAsia="Open Sans" w:cs="Open Sans"/>
+          <w:color w:val="000000"/>
+          <w:sz w:val="20"/>
+          <w:szCs w:val="20"/>
+        </w:rPr>
+        <w:t xml:space="preserve">En resumen, este proyecto ha permitido explorar y aplicar múltiples técnicas de visión por computadora utilizando PyTorch, partiendo de tareas básicas de clasificación y llegando hasta la detección avanzada en video, demostrando cómo estas herramientas pue</w:t>
+      </w:r>
+      <w:r>
+        <w:rPr>
+          <w:rFonts w:ascii="Open Sans" w:hAnsi="Open Sans" w:eastAsia="Open Sans" w:cs="Open Sans"/>
+          <w:color w:val="000000"/>
+          <w:sz w:val="20"/>
+          <w:szCs w:val="20"/>
+        </w:rPr>
+        <w:t xml:space="preserve">den escalarse y adaptarse a distintos contextos, incluyendo escenarios del mundo real.</w:t>
+      </w:r>
+      <w:r>
+        <w:rPr>
+          <w:rFonts w:ascii="Open Sans" w:hAnsi="Open Sans" w:cs="Open Sans"/>
+          <w:sz w:val="20"/>
+          <w:szCs w:val="20"/>
+        </w:rPr>
+      </w:r>
+      <w:r>
+        <w:rPr>
+          <w:rFonts w:ascii="Open Sans" w:hAnsi="Open Sans" w:cs="Open Sans"/>
+          <w:sz w:val="20"/>
+          <w:szCs w:val="20"/>
+        </w:rPr>
+      </w:r>
+    </w:p>
+    <w:p>
+      <w:pPr>
+        <w:pBdr>
+          <w:top w:val="none" w:color="000000" w:sz="4" w:space="0"/>
+          <w:left w:val="none" w:color="000000" w:sz="4" w:space="0"/>
+          <w:bottom w:val="none" w:color="000000" w:sz="4" w:space="0"/>
+          <w:right w:val="none" w:color="000000" w:sz="4" w:space="0"/>
+        </w:pBdr>
+        <w:spacing/>
+        <w:ind w:right="0" w:firstLine="0" w:left="0"/>
+        <w:rPr>
+          <w:rFonts w:ascii="Open Sans" w:hAnsi="Open Sans" w:cs="Open Sans"/>
+          <w:sz w:val="20"/>
+          <w:szCs w:val="20"/>
+        </w:rPr>
+      </w:pPr>
+      <w:r>
+        <w:rPr>
+          <w:rFonts w:ascii="Open Sans" w:hAnsi="Open Sans" w:cs="Open Sans"/>
+          <w:sz w:val="20"/>
+          <w:szCs w:val="20"/>
+        </w:rPr>
+      </w:r>
+      <w:r>
+        <w:rPr>
+          <w:rFonts w:ascii="Open Sans" w:hAnsi="Open Sans" w:cs="Open Sans"/>
+          <w:sz w:val="20"/>
+          <w:szCs w:val="20"/>
+        </w:rPr>
+      </w:r>
+    </w:p>
+    <w:p>
+      <w:pPr>
+        <w:pBdr>
+          <w:top w:val="none" w:color="000000" w:sz="4" w:space="0"/>
+          <w:left w:val="none" w:color="000000" w:sz="4" w:space="0"/>
+          <w:bottom w:val="none" w:color="000000" w:sz="4" w:space="0"/>
+          <w:right w:val="none" w:color="000000" w:sz="4" w:space="0"/>
+        </w:pBdr>
+        <w:spacing/>
+        <w:ind w:right="0" w:firstLine="0" w:left="0"/>
+        <w:rPr>
+          <w:rFonts w:ascii="Open Sans" w:hAnsi="Open Sans" w:cs="Open Sans"/>
+          <w:sz w:val="20"/>
+          <w:szCs w:val="20"/>
+        </w:rPr>
+      </w:pPr>
+      <w:r>
+        <w:rPr>
+          <w:rFonts w:ascii="Open Sans" w:hAnsi="Open Sans" w:cs="Open Sans"/>
+          <w:sz w:val="20"/>
+          <w:szCs w:val="20"/>
+        </w:rPr>
+      </w:r>
+      <w:r>
+        <w:rPr>
+          <w:rFonts w:ascii="Open Sans" w:hAnsi="Open Sans" w:cs="Open Sans"/>
+          <w:sz w:val="20"/>
+          <w:szCs w:val="20"/>
+        </w:rPr>
+      </w:r>
+    </w:p>
+    <w:p>
+      <w:pPr>
+        <w:pBdr>
+          <w:top w:val="none" w:color="000000" w:sz="4" w:space="0"/>
+          <w:left w:val="none" w:color="000000" w:sz="4" w:space="0"/>
+          <w:bottom w:val="none" w:color="000000" w:sz="4" w:space="0"/>
+          <w:right w:val="none" w:color="000000" w:sz="4" w:space="0"/>
+        </w:pBdr>
+        <w:spacing/>
+        <w:ind w:right="0" w:firstLine="0" w:left="0"/>
+        <w:rPr>
+          <w:rFonts w:ascii="Open Sans" w:hAnsi="Open Sans" w:cs="Open Sans"/>
+          <w:sz w:val="20"/>
+          <w:szCs w:val="20"/>
+        </w:rPr>
+      </w:pPr>
+      <w:r>
+        <w:rPr>
+          <w:rFonts w:ascii="Open Sans" w:hAnsi="Open Sans" w:cs="Open Sans"/>
+          <w:sz w:val="20"/>
+          <w:szCs w:val="20"/>
+        </w:rPr>
+      </w:r>
+      <w:r>
+        <w:rPr>
+          <w:rFonts w:ascii="Open Sans" w:hAnsi="Open Sans" w:cs="Open Sans"/>
+          <w:sz w:val="20"/>
+          <w:szCs w:val="20"/>
+        </w:rPr>
+      </w:r>
+    </w:p>
+    <w:p>
+      <w:pPr>
+        <w:pBdr>
+          <w:top w:val="none" w:color="000000" w:sz="4" w:space="0"/>
+          <w:left w:val="none" w:color="000000" w:sz="4" w:space="0"/>
+          <w:bottom w:val="none" w:color="000000" w:sz="4" w:space="0"/>
+          <w:right w:val="none" w:color="000000" w:sz="4" w:space="0"/>
+        </w:pBdr>
+        <w:spacing/>
+        <w:ind w:right="0" w:firstLine="0" w:left="0"/>
+        <w:rPr>
+          <w:rFonts w:ascii="Open Sans" w:hAnsi="Open Sans" w:eastAsia="Open Sans" w:cs="Open Sans"/>
+          <w:color w:val="000000"/>
+          <w:sz w:val="20"/>
+          <w:szCs w:val="20"/>
+          <w:highlight w:val="none"/>
+        </w:rPr>
+      </w:pPr>
+      <w:r>
+        <w:rPr>
+          <w:rFonts w:ascii="Open Sans" w:hAnsi="Open Sans" w:eastAsia="Open Sans" w:cs="Open Sans"/>
+          <w:color w:val="000000"/>
+          <w:sz w:val="20"/>
+          <w:szCs w:val="20"/>
+        </w:rPr>
+        <w:t xml:space="preserve">Parte 1: </w:t>
       </w:r>
       <w:r>
         <w:rPr>
@@ -200,7 +773,7 @@
           <w:sz w:val="20"/>
           <w:szCs w:val="20"/>
         </w:rPr>
-        <w:t xml:space="preserve">2. Descripción del Dataset</w:t>
+        <w:t xml:space="preserve">1.Descripción del Dataset</w:t>
       </w:r>
       <w:r>
         <w:rPr>
@@ -233,7 +806,35 @@
           <w:sz w:val="20"/>
           <w:szCs w:val="20"/>
         </w:rPr>
-        <w:t xml:space="preserve">El dataset está organizado de la siguiente manera:</w:t>
+        <w:t xml:space="preserve">El conjunto de datos utilizado en este proyecto se titula </w:t>
+      </w:r>
+      <w:r>
+        <w:rPr>
+          <w:rFonts w:ascii="Open Sans" w:hAnsi="Open Sans" w:eastAsia="Open Sans" w:cs="Open Sans"/>
+          <w:b/>
+          <w:color w:val="000000"/>
+          <w:sz w:val="20"/>
+          <w:szCs w:val="20"/>
+        </w:rPr>
+        <w:t xml:space="preserve">"Fruit Image Dataset: Fresh and Rotten Fruits"</w:t>
+      </w:r>
+      <w:r>
+        <w:rPr>
+          <w:rFonts w:ascii="Open Sans" w:hAnsi="Open Sans" w:eastAsia="Open Sans" w:cs="Open Sans"/>
+          <w:color w:val="000000"/>
+          <w:sz w:val="20"/>
+          <w:szCs w:val="20"/>
+        </w:rPr>
+        <w:t xml:space="preserve"> y ha sido diseñado específicamente para tareas de clasificación de imágenes relacionadas con la calidad de frutas. Este dataset es ideal para entrenar modelos de aprendizaje profundo que permitan diferenciar entre frutas en buen estado (frescas) y frutas </w:t>
+      </w:r>
+      <w:r>
+        <w:rPr>
+          <w:rFonts w:ascii="Open Sans" w:hAnsi="Open Sans" w:eastAsia="Open Sans" w:cs="Open Sans"/>
+          <w:color w:val="000000"/>
+          <w:sz w:val="20"/>
+          <w:szCs w:val="20"/>
+        </w:rPr>
+        <w:t xml:space="preserve">en mal estado (podridas), lo cual tiene aplicaciones prácticas en áreas como la agricultura, el control de calidad en supermercados o fábricas de procesamiento de alimentos.</w:t>
       </w:r>
       <w:r>
         <w:rPr>
@@ -245,6 +846,7 @@
     </w:p>
     <w:p>
       <w:pPr>
+        <w:pStyle w:val="140"/>
         <w:pBdr>
           <w:top w:val="none" w:color="000000" w:sz="4" w:space="0"/>
           <w:left w:val="none" w:color="000000" w:sz="4" w:space="0"/>
@@ -255,17 +857,19 @@
         <w:ind w:right="0" w:firstLine="0" w:left="0"/>
         <w:rPr>
           <w:rFonts w:ascii="Open Sans" w:hAnsi="Open Sans" w:cs="Open Sans"/>
+          <w:sz w:val="20"/>
           <w:szCs w:val="20"/>
         </w:rPr>
       </w:pPr>
       <w:r>
         <w:rPr>
           <w:rFonts w:ascii="Open Sans" w:hAnsi="Open Sans" w:eastAsia="Open Sans" w:cs="Open Sans"/>
+          <w:b/>
           <w:color w:val="000000"/>
           <w:sz w:val="20"/>
           <w:szCs w:val="20"/>
         </w:rPr>
-        <w:t xml:space="preserve">FruitImages/</w:t>
+        <w:t xml:space="preserve">Estructura del Dataset</w:t>
       </w:r>
       <w:r>
         <w:rPr>
@@ -287,6 +891,7 @@
         <w:ind w:right="0" w:firstLine="0" w:left="0"/>
         <w:rPr>
           <w:rFonts w:ascii="Open Sans" w:hAnsi="Open Sans" w:cs="Open Sans"/>
+          <w:sz w:val="20"/>
           <w:szCs w:val="20"/>
         </w:rPr>
       </w:pPr>
@@ -297,7 +902,7 @@
           <w:sz w:val="20"/>
           <w:szCs w:val="20"/>
         </w:rPr>
-        <w:t xml:space="preserve">├── train/</w:t>
+        <w:t xml:space="preserve">El dataset está organizado en dos carpetas principales:</w:t>
       </w:r>
       <w:r>
         <w:rPr>
@@ -309,6 +914,11 @@
     </w:p>
     <w:p>
       <w:pPr>
+        <w:pStyle w:val="664"/>
+        <w:numPr>
+          <w:ilvl w:val="0"/>
+          <w:numId w:val="11"/>
+        </w:numPr>
         <w:pBdr>
           <w:top w:val="none" w:color="000000" w:sz="4" w:space="0"/>
           <w:left w:val="none" w:color="000000" w:sz="4" w:space="0"/>
@@ -316,12 +926,23 @@
           <w:right w:val="none" w:color="000000" w:sz="4" w:space="0"/>
         </w:pBdr>
         <w:spacing/>
-        <w:ind w:right="0" w:firstLine="0" w:left="0"/>
+        <w:ind w:right="0"/>
         <w:rPr>
           <w:rFonts w:ascii="Open Sans" w:hAnsi="Open Sans" w:cs="Open Sans"/>
+          <w:sz w:val="20"/>
           <w:szCs w:val="20"/>
         </w:rPr>
       </w:pPr>
+      <w:r>
+        <w:rPr>
+          <w:rFonts w:ascii="Open Sans" w:hAnsi="Open Sans" w:eastAsia="Open Sans" w:cs="Open Sans"/>
+          <w:b/>
+          <w:color w:val="000000"/>
+          <w:sz w:val="20"/>
+          <w:szCs w:val="20"/>
+        </w:rPr>
+        <w:t xml:space="preserve">train/</w:t>
+      </w:r>
       <w:r>
         <w:rPr>
           <w:rFonts w:ascii="Open Sans" w:hAnsi="Open Sans" w:eastAsia="Open Sans" w:cs="Open Sans"/>
@@ -329,7 +950,7 @@
           <w:sz w:val="20"/>
           <w:szCs w:val="20"/>
         </w:rPr>
-        <w:t xml:space="preserve">│   ├── freshapples/</w:t>
+        <w:t xml:space="preserve">: contiene las imágenes utilizadas para entrenar y validar el modelo.</w:t>
       </w:r>
       <w:r>
         <w:rPr>
@@ -341,6 +962,11 @@
     </w:p>
     <w:p>
       <w:pPr>
+        <w:pStyle w:val="664"/>
+        <w:numPr>
+          <w:ilvl w:val="0"/>
+          <w:numId w:val="11"/>
+        </w:numPr>
         <w:pBdr>
           <w:top w:val="none" w:color="000000" w:sz="4" w:space="0"/>
           <w:left w:val="none" w:color="000000" w:sz="4" w:space="0"/>
@@ -348,12 +974,23 @@
           <w:right w:val="none" w:color="000000" w:sz="4" w:space="0"/>
         </w:pBdr>
         <w:spacing/>
-        <w:ind w:right="0" w:firstLine="0" w:left="0"/>
+        <w:ind w:right="0"/>
         <w:rPr>
           <w:rFonts w:ascii="Open Sans" w:hAnsi="Open Sans" w:cs="Open Sans"/>
+          <w:sz w:val="20"/>
           <w:szCs w:val="20"/>
         </w:rPr>
       </w:pPr>
+      <w:r>
+        <w:rPr>
+          <w:rFonts w:ascii="Open Sans" w:hAnsi="Open Sans" w:eastAsia="Open Sans" w:cs="Open Sans"/>
+          <w:b/>
+          <w:color w:val="000000"/>
+          <w:sz w:val="20"/>
+          <w:szCs w:val="20"/>
+        </w:rPr>
+        <w:t xml:space="preserve">test/</w:t>
+      </w:r>
       <w:r>
         <w:rPr>
           <w:rFonts w:ascii="Open Sans" w:hAnsi="Open Sans" w:eastAsia="Open Sans" w:cs="Open Sans"/>
@@ -361,7 +998,7 @@
           <w:sz w:val="20"/>
           <w:szCs w:val="20"/>
         </w:rPr>
-        <w:t xml:space="preserve">│   ├── freshbanana/</w:t>
+        <w:t xml:space="preserve">: contiene las imágenes destinadas a evaluar el rendimiento final del modelo una vez entrenado.</w:t>
       </w:r>
       <w:r>
         <w:rPr>
@@ -383,6 +1020,7 @@
         <w:ind w:right="0" w:firstLine="0" w:left="0"/>
         <w:rPr>
           <w:rFonts w:ascii="Open Sans" w:hAnsi="Open Sans" w:cs="Open Sans"/>
+          <w:sz w:val="20"/>
           <w:szCs w:val="20"/>
         </w:rPr>
       </w:pPr>
@@ -393,7 +1031,7 @@
           <w:sz w:val="20"/>
           <w:szCs w:val="20"/>
         </w:rPr>
-        <w:t xml:space="preserve">│   ├── freshoranges/</w:t>
+        <w:t xml:space="preserve">Dentro de cada una de estas carpetas, las imágenes están clasificadas en seis subcarpetas, correspondientes a las siguientes clases:</w:t>
       </w:r>
       <w:r>
         <w:rPr>
@@ -405,6 +1043,11 @@
     </w:p>
     <w:p>
       <w:pPr>
+        <w:pStyle w:val="664"/>
+        <w:numPr>
+          <w:ilvl w:val="0"/>
+          <w:numId w:val="12"/>
+        </w:numPr>
         <w:pBdr>
           <w:top w:val="none" w:color="000000" w:sz="4" w:space="0"/>
           <w:left w:val="none" w:color="000000" w:sz="4" w:space="0"/>
@@ -412,9 +1055,10 @@
           <w:right w:val="none" w:color="000000" w:sz="4" w:space="0"/>
         </w:pBdr>
         <w:spacing/>
-        <w:ind w:right="0" w:firstLine="0" w:left="0"/>
+        <w:ind w:right="0"/>
         <w:rPr>
           <w:rFonts w:ascii="Open Sans" w:hAnsi="Open Sans" w:cs="Open Sans"/>
+          <w:sz w:val="20"/>
           <w:szCs w:val="20"/>
         </w:rPr>
       </w:pPr>
@@ -425,7 +1069,16 @@
           <w:sz w:val="20"/>
           <w:szCs w:val="20"/>
         </w:rPr>
-        <w:t xml:space="preserve">│   ├── rottenapples/</w:t>
+        <w:t xml:space="preserve">freshapples/</w:t>
+      </w:r>
+      <w:r>
+        <w:rPr>
+          <w:rFonts w:ascii="Open Sans" w:hAnsi="Open Sans" w:eastAsia="Open Sans" w:cs="Open Sans"/>
+          <w:color w:val="000000"/>
+          <w:sz w:val="20"/>
+          <w:szCs w:val="20"/>
+        </w:rPr>
+        <w:t xml:space="preserve">: manzanas frescas</w:t>
       </w:r>
       <w:r>
         <w:rPr>
@@ -437,6 +1090,11 @@
     </w:p>
     <w:p>
       <w:pPr>
+        <w:pStyle w:val="664"/>
+        <w:numPr>
+          <w:ilvl w:val="0"/>
+          <w:numId w:val="12"/>
+        </w:numPr>
         <w:pBdr>
           <w:top w:val="none" w:color="000000" w:sz="4" w:space="0"/>
           <w:left w:val="none" w:color="000000" w:sz="4" w:space="0"/>
@@ -444,9 +1102,10 @@
           <w:right w:val="none" w:color="000000" w:sz="4" w:space="0"/>
         </w:pBdr>
         <w:spacing/>
-        <w:ind w:right="0" w:firstLine="0" w:left="0"/>
+        <w:ind w:right="0"/>
         <w:rPr>
           <w:rFonts w:ascii="Open Sans" w:hAnsi="Open Sans" w:cs="Open Sans"/>
+          <w:sz w:val="20"/>
           <w:szCs w:val="20"/>
         </w:rPr>
       </w:pPr>
@@ -457,7 +1116,16 @@
           <w:sz w:val="20"/>
           <w:szCs w:val="20"/>
         </w:rPr>
-        <w:t xml:space="preserve">│   ├── rottenbanana/</w:t>
+        <w:t xml:space="preserve">freshbanana/</w:t>
+      </w:r>
+      <w:r>
+        <w:rPr>
+          <w:rFonts w:ascii="Open Sans" w:hAnsi="Open Sans" w:eastAsia="Open Sans" w:cs="Open Sans"/>
+          <w:color w:val="000000"/>
+          <w:sz w:val="20"/>
+          <w:szCs w:val="20"/>
+        </w:rPr>
+        <w:t xml:space="preserve">: bananas frescas</w:t>
       </w:r>
       <w:r>
         <w:rPr>
@@ -469,6 +1137,11 @@
     </w:p>
     <w:p>
       <w:pPr>
+        <w:pStyle w:val="664"/>
+        <w:numPr>
+          <w:ilvl w:val="0"/>
+          <w:numId w:val="12"/>
+        </w:numPr>
         <w:pBdr>
           <w:top w:val="none" w:color="000000" w:sz="4" w:space="0"/>
           <w:left w:val="none" w:color="000000" w:sz="4" w:space="0"/>
@@ -476,9 +1149,10 @@
           <w:right w:val="none" w:color="000000" w:sz="4" w:space="0"/>
         </w:pBdr>
         <w:spacing/>
-        <w:ind w:right="0" w:firstLine="0" w:left="0"/>
+        <w:ind w:right="0"/>
         <w:rPr>
           <w:rFonts w:ascii="Open Sans" w:hAnsi="Open Sans" w:cs="Open Sans"/>
+          <w:sz w:val="20"/>
           <w:szCs w:val="20"/>
         </w:rPr>
       </w:pPr>
@@ -489,7 +1163,16 @@
           <w:sz w:val="20"/>
           <w:szCs w:val="20"/>
         </w:rPr>
-        <w:t xml:space="preserve">│   └── rottenoranges/</w:t>
+        <w:t xml:space="preserve">freshoranges/</w:t>
+      </w:r>
+      <w:r>
+        <w:rPr>
+          <w:rFonts w:ascii="Open Sans" w:hAnsi="Open Sans" w:eastAsia="Open Sans" w:cs="Open Sans"/>
+          <w:color w:val="000000"/>
+          <w:sz w:val="20"/>
+          <w:szCs w:val="20"/>
+        </w:rPr>
+        <w:t xml:space="preserve">: naranjas frescas</w:t>
       </w:r>
       <w:r>
         <w:rPr>
@@ -501,6 +1184,11 @@
     </w:p>
     <w:p>
       <w:pPr>
+        <w:pStyle w:val="664"/>
+        <w:numPr>
+          <w:ilvl w:val="0"/>
+          <w:numId w:val="12"/>
+        </w:numPr>
         <w:pBdr>
           <w:top w:val="none" w:color="000000" w:sz="4" w:space="0"/>
           <w:left w:val="none" w:color="000000" w:sz="4" w:space="0"/>
@@ -508,9 +1196,10 @@
           <w:right w:val="none" w:color="000000" w:sz="4" w:space="0"/>
         </w:pBdr>
         <w:spacing/>
-        <w:ind w:right="0" w:firstLine="0" w:left="0"/>
+        <w:ind w:right="0"/>
         <w:rPr>
           <w:rFonts w:ascii="Open Sans" w:hAnsi="Open Sans" w:cs="Open Sans"/>
+          <w:sz w:val="20"/>
           <w:szCs w:val="20"/>
         </w:rPr>
       </w:pPr>
@@ -521,7 +1210,16 @@
           <w:sz w:val="20"/>
           <w:szCs w:val="20"/>
         </w:rPr>
-        <w:t xml:space="preserve">└── test/</w:t>
+        <w:t xml:space="preserve">rottenapples/</w:t>
+      </w:r>
+      <w:r>
+        <w:rPr>
+          <w:rFonts w:ascii="Open Sans" w:hAnsi="Open Sans" w:eastAsia="Open Sans" w:cs="Open Sans"/>
+          <w:color w:val="000000"/>
+          <w:sz w:val="20"/>
+          <w:szCs w:val="20"/>
+        </w:rPr>
+        <w:t xml:space="preserve">: manzanas podridas</w:t>
       </w:r>
       <w:r>
         <w:rPr>
@@ -533,6 +1231,11 @@
     </w:p>
     <w:p>
       <w:pPr>
+        <w:pStyle w:val="664"/>
+        <w:numPr>
+          <w:ilvl w:val="0"/>
+          <w:numId w:val="12"/>
+        </w:numPr>
         <w:pBdr>
           <w:top w:val="none" w:color="000000" w:sz="4" w:space="0"/>
           <w:left w:val="none" w:color="000000" w:sz="4" w:space="0"/>
@@ -540,9 +1243,10 @@
           <w:right w:val="none" w:color="000000" w:sz="4" w:space="0"/>
         </w:pBdr>
         <w:spacing/>
-        <w:ind w:right="0" w:firstLine="0" w:left="0"/>
+        <w:ind w:right="0"/>
         <w:rPr>
           <w:rFonts w:ascii="Open Sans" w:hAnsi="Open Sans" w:cs="Open Sans"/>
+          <w:sz w:val="20"/>
           <w:szCs w:val="20"/>
         </w:rPr>
       </w:pPr>
@@ -553,7 +1257,16 @@
           <w:sz w:val="20"/>
           <w:szCs w:val="20"/>
         </w:rPr>
-        <w:t xml:space="preserve">    ├── freshapples/</w:t>
+        <w:t xml:space="preserve">rottenbanana/</w:t>
+      </w:r>
+      <w:r>
+        <w:rPr>
+          <w:rFonts w:ascii="Open Sans" w:hAnsi="Open Sans" w:eastAsia="Open Sans" w:cs="Open Sans"/>
+          <w:color w:val="000000"/>
+          <w:sz w:val="20"/>
+          <w:szCs w:val="20"/>
+        </w:rPr>
+        <w:t xml:space="preserve">: bananas podridas</w:t>
       </w:r>
       <w:r>
         <w:rPr>
@@ -565,6 +1278,11 @@
     </w:p>
     <w:p>
       <w:pPr>
+        <w:pStyle w:val="664"/>
+        <w:numPr>
+          <w:ilvl w:val="0"/>
+          <w:numId w:val="12"/>
+        </w:numPr>
         <w:pBdr>
           <w:top w:val="none" w:color="000000" w:sz="4" w:space="0"/>
           <w:left w:val="none" w:color="000000" w:sz="4" w:space="0"/>
@@ -572,9 +1290,10 @@
           <w:right w:val="none" w:color="000000" w:sz="4" w:space="0"/>
         </w:pBdr>
         <w:spacing/>
-        <w:ind w:right="0" w:firstLine="0" w:left="0"/>
+        <w:ind w:right="0"/>
         <w:rPr>
           <w:rFonts w:ascii="Open Sans" w:hAnsi="Open Sans" w:cs="Open Sans"/>
+          <w:sz w:val="20"/>
           <w:szCs w:val="20"/>
         </w:rPr>
       </w:pPr>
@@ -585,7 +1304,16 @@
           <w:sz w:val="20"/>
           <w:szCs w:val="20"/>
         </w:rPr>
-        <w:t xml:space="preserve">    ├── freshbanana/</w:t>
+        <w:t xml:space="preserve">rottenoranges/</w:t>
+      </w:r>
+      <w:r>
+        <w:rPr>
+          <w:rFonts w:ascii="Open Sans" w:hAnsi="Open Sans" w:eastAsia="Open Sans" w:cs="Open Sans"/>
+          <w:color w:val="000000"/>
+          <w:sz w:val="20"/>
+          <w:szCs w:val="20"/>
+        </w:rPr>
+        <w:t xml:space="preserve">: naranjas podridas</w:t>
       </w:r>
       <w:r>
         <w:rPr>
@@ -607,6 +1335,7 @@
         <w:ind w:right="0" w:firstLine="0" w:left="0"/>
         <w:rPr>
           <w:rFonts w:ascii="Open Sans" w:hAnsi="Open Sans" w:cs="Open Sans"/>
+          <w:sz w:val="20"/>
           <w:szCs w:val="20"/>
         </w:rPr>
       </w:pPr>
@@ -617,7 +1346,25 @@
           <w:sz w:val="20"/>
           <w:szCs w:val="20"/>
         </w:rPr>
-        <w:t xml:space="preserve">    ├── freshoranges/</w:t>
+        <w:t xml:space="preserve">Cada subcarpeta contiene múltiples imágenes en formato </w:t>
+      </w:r>
+      <w:r>
+        <w:rPr>
+          <w:rFonts w:ascii="Open Sans" w:hAnsi="Open Sans" w:eastAsia="Open Sans" w:cs="Open Sans"/>
+          <w:color w:val="000000"/>
+          <w:sz w:val="20"/>
+          <w:szCs w:val="20"/>
+        </w:rPr>
+        <w:t xml:space="preserve">.jpg</w:t>
+      </w:r>
+      <w:r>
+        <w:rPr>
+          <w:rFonts w:ascii="Open Sans" w:hAnsi="Open Sans" w:eastAsia="Open Sans" w:cs="Open Sans"/>
+          <w:color w:val="000000"/>
+          <w:sz w:val="20"/>
+          <w:szCs w:val="20"/>
+        </w:rPr>
+        <w:t xml:space="preserve"> o similar, representando instancias reales de la clase correspondiente.</w:t>
       </w:r>
       <w:r>
         <w:rPr>
@@ -629,6 +1376,7 @@
     </w:p>
     <w:p>
       <w:pPr>
+        <w:pStyle w:val="140"/>
         <w:pBdr>
           <w:top w:val="none" w:color="000000" w:sz="4" w:space="0"/>
           <w:left w:val="none" w:color="000000" w:sz="4" w:space="0"/>
@@ -639,17 +1387,19 @@
         <w:ind w:right="0" w:firstLine="0" w:left="0"/>
         <w:rPr>
           <w:rFonts w:ascii="Open Sans" w:hAnsi="Open Sans" w:cs="Open Sans"/>
+          <w:sz w:val="20"/>
           <w:szCs w:val="20"/>
         </w:rPr>
       </w:pPr>
       <w:r>
         <w:rPr>
           <w:rFonts w:ascii="Open Sans" w:hAnsi="Open Sans" w:eastAsia="Open Sans" w:cs="Open Sans"/>
+          <w:b/>
           <w:color w:val="000000"/>
           <w:sz w:val="20"/>
           <w:szCs w:val="20"/>
         </w:rPr>
-        <w:t xml:space="preserve">    ├── rottenapples/</w:t>
+        <w:t xml:space="preserve">Características del Dataset</w:t>
       </w:r>
       <w:r>
         <w:rPr>
@@ -661,6 +1411,11 @@
     </w:p>
     <w:p>
       <w:pPr>
+        <w:pStyle w:val="664"/>
+        <w:numPr>
+          <w:ilvl w:val="0"/>
+          <w:numId w:val="13"/>
+        </w:numPr>
         <w:pBdr>
           <w:top w:val="none" w:color="000000" w:sz="4" w:space="0"/>
           <w:left w:val="none" w:color="000000" w:sz="4" w:space="0"/>
@@ -668,12 +1423,23 @@
           <w:right w:val="none" w:color="000000" w:sz="4" w:space="0"/>
         </w:pBdr>
         <w:spacing/>
-        <w:ind w:right="0" w:firstLine="0" w:left="0"/>
+        <w:ind w:right="0"/>
         <w:rPr>
           <w:rFonts w:ascii="Open Sans" w:hAnsi="Open Sans" w:cs="Open Sans"/>
+          <w:sz w:val="20"/>
           <w:szCs w:val="20"/>
         </w:rPr>
       </w:pPr>
+      <w:r>
+        <w:rPr>
+          <w:rFonts w:ascii="Open Sans" w:hAnsi="Open Sans" w:eastAsia="Open Sans" w:cs="Open Sans"/>
+          <w:b/>
+          <w:color w:val="000000"/>
+          <w:sz w:val="20"/>
+          <w:szCs w:val="20"/>
+        </w:rPr>
+        <w:t xml:space="preserve">Cantidad de clases</w:t>
+      </w:r>
       <w:r>
         <w:rPr>
           <w:rFonts w:ascii="Open Sans" w:hAnsi="Open Sans" w:eastAsia="Open Sans" w:cs="Open Sans"/>
@@ -681,7 +1447,7 @@
           <w:sz w:val="20"/>
           <w:szCs w:val="20"/>
         </w:rPr>
-        <w:t xml:space="preserve">    ├── rottenbanana/</w:t>
+        <w:t xml:space="preserve">: 6</w:t>
       </w:r>
       <w:r>
         <w:rPr>
@@ -693,6 +1459,11 @@
     </w:p>
     <w:p>
       <w:pPr>
+        <w:pStyle w:val="664"/>
+        <w:numPr>
+          <w:ilvl w:val="0"/>
+          <w:numId w:val="13"/>
+        </w:numPr>
         <w:pBdr>
           <w:top w:val="none" w:color="000000" w:sz="4" w:space="0"/>
           <w:left w:val="none" w:color="000000" w:sz="4" w:space="0"/>
@@ -700,12 +1471,23 @@
           <w:right w:val="none" w:color="000000" w:sz="4" w:space="0"/>
         </w:pBdr>
         <w:spacing/>
-        <w:ind w:right="0" w:firstLine="0" w:left="0"/>
+        <w:ind w:right="0"/>
         <w:rPr>
           <w:rFonts w:ascii="Open Sans" w:hAnsi="Open Sans" w:cs="Open Sans"/>
+          <w:sz w:val="20"/>
           <w:szCs w:val="20"/>
         </w:rPr>
       </w:pPr>
+      <w:r>
+        <w:rPr>
+          <w:rFonts w:ascii="Open Sans" w:hAnsi="Open Sans" w:eastAsia="Open Sans" w:cs="Open Sans"/>
+          <w:b/>
+          <w:color w:val="000000"/>
+          <w:sz w:val="20"/>
+          <w:szCs w:val="20"/>
+        </w:rPr>
+        <w:t xml:space="preserve">Tipo de clasificación</w:t>
+      </w:r>
       <w:r>
         <w:rPr>
           <w:rFonts w:ascii="Open Sans" w:hAnsi="Open Sans" w:eastAsia="Open Sans" w:cs="Open Sans"/>
@@ -713,7 +1495,134 @@
           <w:sz w:val="20"/>
           <w:szCs w:val="20"/>
         </w:rPr>
-        <w:t xml:space="preserve">    └── rottenoranges/</w:t>
+        <w:t xml:space="preserve">: Multiclase (una sola etiqueta por imagen)</w:t>
+      </w:r>
+      <w:r>
+        <w:rPr>
+          <w:rFonts w:ascii="Open Sans" w:hAnsi="Open Sans" w:eastAsia="Open Sans" w:cs="Open Sans"/>
+          <w:sz w:val="20"/>
+          <w:szCs w:val="20"/>
+        </w:rPr>
+      </w:r>
+    </w:p>
+    <w:p>
+      <w:pPr>
+        <w:pStyle w:val="664"/>
+        <w:numPr>
+          <w:ilvl w:val="0"/>
+          <w:numId w:val="13"/>
+        </w:numPr>
+        <w:pBdr>
+          <w:top w:val="none" w:color="000000" w:sz="4" w:space="0"/>
+          <w:left w:val="none" w:color="000000" w:sz="4" w:space="0"/>
+          <w:bottom w:val="none" w:color="000000" w:sz="4" w:space="0"/>
+          <w:right w:val="none" w:color="000000" w:sz="4" w:space="0"/>
+        </w:pBdr>
+        <w:spacing/>
+        <w:ind w:right="0"/>
+        <w:rPr>
+          <w:rFonts w:ascii="Open Sans" w:hAnsi="Open Sans" w:cs="Open Sans"/>
+          <w:sz w:val="20"/>
+          <w:szCs w:val="20"/>
+        </w:rPr>
+      </w:pPr>
+      <w:r>
+        <w:rPr>
+          <w:rFonts w:ascii="Open Sans" w:hAnsi="Open Sans" w:eastAsia="Open Sans" w:cs="Open Sans"/>
+          <w:b/>
+          <w:color w:val="000000"/>
+          <w:sz w:val="20"/>
+          <w:szCs w:val="20"/>
+        </w:rPr>
+        <w:t xml:space="preserve">Formato de imágenes</w:t>
+      </w:r>
+      <w:r>
+        <w:rPr>
+          <w:rFonts w:ascii="Open Sans" w:hAnsi="Open Sans" w:eastAsia="Open Sans" w:cs="Open Sans"/>
+          <w:color w:val="000000"/>
+          <w:sz w:val="20"/>
+          <w:szCs w:val="20"/>
+        </w:rPr>
+        <w:t xml:space="preserve">: Imágenes a color (RGB), de distintas resoluciones</w:t>
+      </w:r>
+      <w:r>
+        <w:rPr>
+          <w:rFonts w:ascii="Open Sans" w:hAnsi="Open Sans" w:eastAsia="Open Sans" w:cs="Open Sans"/>
+          <w:sz w:val="20"/>
+          <w:szCs w:val="20"/>
+        </w:rPr>
+      </w:r>
+    </w:p>
+    <w:p>
+      <w:pPr>
+        <w:pStyle w:val="664"/>
+        <w:numPr>
+          <w:ilvl w:val="0"/>
+          <w:numId w:val="13"/>
+        </w:numPr>
+        <w:pBdr>
+          <w:top w:val="none" w:color="000000" w:sz="4" w:space="0"/>
+          <w:left w:val="none" w:color="000000" w:sz="4" w:space="0"/>
+          <w:bottom w:val="none" w:color="000000" w:sz="4" w:space="0"/>
+          <w:right w:val="none" w:color="000000" w:sz="4" w:space="0"/>
+        </w:pBdr>
+        <w:spacing/>
+        <w:ind w:right="0"/>
+        <w:rPr>
+          <w:rFonts w:ascii="Open Sans" w:hAnsi="Open Sans" w:cs="Open Sans"/>
+          <w:sz w:val="20"/>
+          <w:szCs w:val="20"/>
+        </w:rPr>
+      </w:pPr>
+      <w:r>
+        <w:rPr>
+          <w:rFonts w:ascii="Open Sans" w:hAnsi="Open Sans" w:eastAsia="Open Sans" w:cs="Open Sans"/>
+          <w:b/>
+          <w:color w:val="000000"/>
+          <w:sz w:val="20"/>
+          <w:szCs w:val="20"/>
+        </w:rPr>
+        <w:t xml:space="preserve">Etiquetado</w:t>
+      </w:r>
+      <w:r>
+        <w:rPr>
+          <w:rFonts w:ascii="Open Sans" w:hAnsi="Open Sans" w:eastAsia="Open Sans" w:cs="Open Sans"/>
+          <w:color w:val="000000"/>
+          <w:sz w:val="20"/>
+          <w:szCs w:val="20"/>
+        </w:rPr>
+        <w:t xml:space="preserve">: Implícito, mediante la estructura de carpetas</w:t>
+      </w:r>
+      <w:r>
+        <w:rPr>
+          <w:rFonts w:ascii="Open Sans" w:hAnsi="Open Sans" w:eastAsia="Open Sans" w:cs="Open Sans"/>
+          <w:sz w:val="20"/>
+          <w:szCs w:val="20"/>
+        </w:rPr>
+      </w:r>
+    </w:p>
+    <w:p>
+      <w:pPr>
+        <w:pBdr>
+          <w:top w:val="none" w:color="000000" w:sz="4" w:space="0"/>
+          <w:left w:val="none" w:color="000000" w:sz="4" w:space="0"/>
+          <w:bottom w:val="none" w:color="000000" w:sz="4" w:space="0"/>
+          <w:right w:val="none" w:color="000000" w:sz="4" w:space="0"/>
+        </w:pBdr>
+        <w:spacing/>
+        <w:ind w:right="0" w:firstLine="0" w:left="0"/>
+        <w:rPr>
+          <w:rFonts w:ascii="Open Sans" w:hAnsi="Open Sans" w:cs="Open Sans"/>
+          <w:szCs w:val="20"/>
+        </w:rPr>
+      </w:pPr>
+      <w:r>
+        <w:rPr>
+          <w:rFonts w:ascii="Open Sans" w:hAnsi="Open Sans" w:eastAsia="Open Sans" w:cs="Open Sans"/>
+          <w:color w:val="000000"/>
+          <w:sz w:val="20"/>
+          <w:szCs w:val="20"/>
+        </w:rPr>
       </w:r>
       <w:r>
         <w:rPr>
@@ -755,6 +1664,7 @@
     </w:p>
     <w:p>
       <w:pPr>
+        <w:pStyle w:val="139"/>
         <w:pBdr>
           <w:top w:val="none" w:color="000000" w:sz="4" w:space="0"/>
           <w:left w:val="none" w:color="000000" w:sz="4" w:space="0"/>
@@ -772,47 +1682,54 @@
       <w:r>
         <w:rPr>
           <w:rFonts w:ascii="Open Sans" w:hAnsi="Open Sans" w:eastAsia="Open Sans" w:cs="Open Sans"/>
+          <w:b/>
+          <w:color w:val="000000"/>
+          <w:sz w:val="20"/>
+          <w:szCs w:val="20"/>
+          <w:highlight w:val="none"/>
+        </w:rPr>
+      </w:r>
+      <w:r>
+        <w:rPr>
+          <w:rFonts w:ascii="Open Sans" w:hAnsi="Open Sans" w:eastAsia="Open Sans" w:cs="Open Sans"/>
+          <w:b/>
+          <w:color w:val="000000"/>
+          <w:sz w:val="20"/>
+          <w:szCs w:val="20"/>
+          <w:highlight w:val="none"/>
+        </w:rPr>
+      </w:r>
+    </w:p>
+    <w:p>
+      <w:pPr>
+        <w:pStyle w:val="139"/>
+        <w:pBdr>
+          <w:top w:val="none" w:color="000000" w:sz="4" w:space="0"/>
+          <w:left w:val="none" w:color="000000" w:sz="4" w:space="0"/>
+          <w:bottom w:val="none" w:color="000000" w:sz="4" w:space="0"/>
+          <w:right w:val="none" w:color="000000" w:sz="4" w:space="0"/>
+        </w:pBdr>
+        <w:spacing/>
+        <w:ind w:right="0" w:firstLine="0" w:left="0"/>
+        <w:rPr>
+          <w:rFonts w:ascii="Open Sans" w:hAnsi="Open Sans" w:eastAsia="Open Sans" w:cs="Open Sans"/>
+          <w:b/>
+          <w:bCs/>
+          <w:color w:val="000000"/>
+          <w:sz w:val="20"/>
+          <w:szCs w:val="20"/>
+          <w:highlight w:val="none"/>
+        </w:rPr>
+      </w:pPr>
+      <w:r>
+        <w:rPr>
+          <w:rFonts w:ascii="Open Sans" w:hAnsi="Open Sans" w:eastAsia="Open Sans" w:cs="Open Sans"/>
+          <w:b/>
           <w:color w:val="000000"/>
           <w:sz w:val="20"/>
           <w:szCs w:val="20"/>
         </w:rPr>
-        <w:t xml:space="preserve">Cada subcarpeta contiene imágenes correspondientes a la clase que indica su nombre. Para la etapa de entrenamiento se utilizó la carpeta </w:t>
-      </w:r>
-      <w:r>
-        <w:rPr>
-          <w:rFonts w:ascii="Open Sans" w:hAnsi="Open Sans" w:eastAsia="Open Sans" w:cs="Open Sans"/>
-          <w:color w:val="000000"/>
-          <w:sz w:val="20"/>
-          <w:szCs w:val="20"/>
-        </w:rPr>
-        <w:t xml:space="preserve">train</w:t>
-      </w:r>
-      <w:r>
-        <w:rPr>
-          <w:rFonts w:ascii="Open Sans" w:hAnsi="Open Sans" w:eastAsia="Open Sans" w:cs="Open Sans"/>
-          <w:color w:val="000000"/>
-          <w:sz w:val="20"/>
-          <w:szCs w:val="20"/>
-        </w:rPr>
-        <w:t xml:space="preserve">, y para la evaluación final el conjunto </w:t>
-      </w:r>
-      <w:r>
-        <w:rPr>
-          <w:rFonts w:ascii="Open Sans" w:hAnsi="Open Sans" w:eastAsia="Open Sans" w:cs="Open Sans"/>
-          <w:color w:val="000000"/>
-          <w:sz w:val="20"/>
-          <w:szCs w:val="20"/>
-        </w:rPr>
-        <w:t xml:space="preserve">test</w:t>
-      </w:r>
-      <w:r>
-        <w:rPr>
-          <w:rFonts w:ascii="Open Sans" w:hAnsi="Open Sans" w:eastAsia="Open Sans" w:cs="Open Sans"/>
-          <w:color w:val="000000"/>
-          <w:sz w:val="20"/>
-          <w:szCs w:val="20"/>
-        </w:rPr>
-        <w:t xml:space="preserve">.</w:t>
+        <w:t xml:space="preserve">2. Preprocesamiento de Datos</w:t>
       </w:r>
       <w:r>
         <w:rPr>
@@ -824,7 +1741,7 @@
     </w:p>
     <w:p>
       <w:pPr>
-        <w:pStyle w:val="139"/>
+        <w:pStyle w:val="140"/>
         <w:pBdr>
           <w:top w:val="none" w:color="000000" w:sz="4" w:space="0"/>
           <w:left w:val="none" w:color="000000" w:sz="4" w:space="0"/>
@@ -847,42 +1764,7 @@
           <w:sz w:val="20"/>
           <w:szCs w:val="20"/>
         </w:rPr>
-        <w:t xml:space="preserve">3. Preprocesamiento de Datos</w:t>
-      </w:r>
-      <w:r>
-        <w:rPr>
-          <w:rFonts w:ascii="Open Sans" w:hAnsi="Open Sans" w:eastAsia="Open Sans" w:cs="Open Sans"/>
-          <w:sz w:val="20"/>
-          <w:szCs w:val="20"/>
-        </w:rPr>
-      </w:r>
-    </w:p>
-    <w:p>
-      <w:pPr>
-        <w:pStyle w:val="140"/>
-        <w:pBdr>
-          <w:top w:val="none" w:color="000000" w:sz="4" w:space="0"/>
-          <w:left w:val="none" w:color="000000" w:sz="4" w:space="0"/>
-          <w:bottom w:val="none" w:color="000000" w:sz="4" w:space="0"/>
-          <w:right w:val="none" w:color="000000" w:sz="4" w:space="0"/>
-        </w:pBdr>
-        <w:spacing/>
-        <w:ind w:right="0" w:firstLine="0" w:left="0"/>
-        <w:rPr>
-          <w:rFonts w:ascii="Open Sans" w:hAnsi="Open Sans" w:cs="Open Sans"/>
-          <w:sz w:val="20"/>
-          <w:szCs w:val="20"/>
-        </w:rPr>
-      </w:pPr>
-      <w:r>
-        <w:rPr>
-          <w:rFonts w:ascii="Open Sans" w:hAnsi="Open Sans" w:eastAsia="Open Sans" w:cs="Open Sans"/>
-          <w:b/>
-          <w:color w:val="000000"/>
-          <w:sz w:val="20"/>
-          <w:szCs w:val="20"/>
-        </w:rPr>
-        <w:t xml:space="preserve">3.1. Carga de Imágenes</w:t>
+        <w:t xml:space="preserve">2.1. Carga de Imágenes</w:t>
       </w:r>
       <w:r>
         <w:rPr>
@@ -987,7 +1869,7 @@
           <w:sz w:val="20"/>
           <w:szCs w:val="20"/>
         </w:rPr>
-        <w:t xml:space="preserve">3.2. Transformaciones y Data Augmentation</w:t>
+        <w:t xml:space="preserve">2.2. Transformaciones y Data Augmentation</w:t>
       </w:r>
       <w:r>
         <w:rPr>
@@ -1182,7 +2064,7 @@
           <w:sz w:val="20"/>
           <w:szCs w:val="20"/>
         </w:rPr>
-        <w:t xml:space="preserve">3.3. División del Conjunto de Datos</w:t>
+        <w:t xml:space="preserve">2.3. División del Conjunto de Datos</w:t>
       </w:r>
       <w:r>
         <w:rPr>
@@ -1366,9 +2248,287 @@
         <w:spacing/>
         <w:ind w:right="0" w:firstLine="0" w:left="0"/>
         <w:rPr>
-          <w:rFonts w:ascii="Open Sans" w:hAnsi="Open Sans" w:cs="Open Sans"/>
+          <w:rFonts w:ascii="Open Sans" w:hAnsi="Open Sans" w:eastAsia="Open Sans" w:cs="Open Sans"/>
+          <w:b/>
+          <w:bCs/>
+          <w:color w:val="000000"/>
           <w:sz w:val="20"/>
           <w:szCs w:val="20"/>
+          <w:highlight w:val="none"/>
+        </w:rPr>
+      </w:pPr>
+      <w:r>
+        <w:rPr>
+          <w:rFonts w:ascii="Open Sans" w:hAnsi="Open Sans" w:eastAsia="Open Sans" w:cs="Open Sans"/>
+          <w:b/>
+          <w:bCs/>
+          <w:color w:val="000000"/>
+          <w:sz w:val="20"/>
+          <w:szCs w:val="20"/>
+          <w:highlight w:val="none"/>
+        </w:rPr>
+      </w:r>
+      <w:r>
+        <w:rPr>
+          <w:rFonts w:ascii="Open Sans" w:hAnsi="Open Sans" w:eastAsia="Open Sans" w:cs="Open Sans"/>
+          <w:b/>
+          <w:bCs/>
+          <w:color w:val="000000"/>
+          <w:sz w:val="20"/>
+          <w:szCs w:val="20"/>
+          <w:highlight w:val="none"/>
+        </w:rPr>
+      </w:r>
+    </w:p>
+    <w:p>
+      <w:pPr>
+        <w:pStyle w:val="139"/>
+        <w:pBdr>
+          <w:top w:val="none" w:color="000000" w:sz="4" w:space="0"/>
+          <w:left w:val="none" w:color="000000" w:sz="4" w:space="0"/>
+          <w:bottom w:val="none" w:color="000000" w:sz="4" w:space="0"/>
+          <w:right w:val="none" w:color="000000" w:sz="4" w:space="0"/>
+        </w:pBdr>
+        <w:spacing/>
+        <w:ind w:right="0" w:firstLine="0" w:left="0"/>
+        <w:rPr>
+          <w:rFonts w:ascii="Open Sans" w:hAnsi="Open Sans" w:eastAsia="Open Sans" w:cs="Open Sans"/>
+          <w:b/>
+          <w:bCs/>
+          <w:color w:val="000000"/>
+          <w:sz w:val="20"/>
+          <w:szCs w:val="20"/>
+          <w:highlight w:val="none"/>
+        </w:rPr>
+      </w:pPr>
+      <w:r>
+        <w:rPr>
+          <w:rFonts w:ascii="Open Sans" w:hAnsi="Open Sans" w:eastAsia="Open Sans" w:cs="Open Sans"/>
+          <w:b/>
+          <w:bCs/>
+          <w:color w:val="000000"/>
+          <w:sz w:val="20"/>
+          <w:szCs w:val="20"/>
+          <w:highlight w:val="none"/>
+        </w:rPr>
+      </w:r>
+      <w:r>
+        <w:rPr>
+          <w:rFonts w:ascii="Open Sans" w:hAnsi="Open Sans" w:eastAsia="Open Sans" w:cs="Open Sans"/>
+          <w:b/>
+          <w:bCs/>
+          <w:color w:val="000000"/>
+          <w:sz w:val="20"/>
+          <w:szCs w:val="20"/>
+          <w:highlight w:val="none"/>
+        </w:rPr>
+      </w:r>
+    </w:p>
+    <w:p>
+      <w:pPr>
+        <w:pStyle w:val="139"/>
+        <w:pBdr>
+          <w:top w:val="none" w:color="000000" w:sz="4" w:space="0"/>
+          <w:left w:val="none" w:color="000000" w:sz="4" w:space="0"/>
+          <w:bottom w:val="none" w:color="000000" w:sz="4" w:space="0"/>
+          <w:right w:val="none" w:color="000000" w:sz="4" w:space="0"/>
+        </w:pBdr>
+        <w:spacing/>
+        <w:ind w:right="0" w:firstLine="0" w:left="0"/>
+        <w:rPr>
+          <w:rFonts w:ascii="Open Sans" w:hAnsi="Open Sans" w:eastAsia="Open Sans" w:cs="Open Sans"/>
+          <w:b/>
+          <w:bCs/>
+          <w:color w:val="000000"/>
+          <w:sz w:val="20"/>
+          <w:szCs w:val="20"/>
+          <w:highlight w:val="none"/>
+        </w:rPr>
+      </w:pPr>
+      <w:r>
+        <w:rPr>
+          <w:rFonts w:ascii="Open Sans" w:hAnsi="Open Sans" w:eastAsia="Open Sans" w:cs="Open Sans"/>
+          <w:b/>
+          <w:bCs/>
+          <w:color w:val="000000"/>
+          <w:sz w:val="20"/>
+          <w:szCs w:val="20"/>
+          <w:highlight w:val="none"/>
+        </w:rPr>
+      </w:r>
+      <w:r>
+        <w:rPr>
+          <w:rFonts w:ascii="Open Sans" w:hAnsi="Open Sans" w:eastAsia="Open Sans" w:cs="Open Sans"/>
+          <w:b/>
+          <w:bCs/>
+          <w:color w:val="000000"/>
+          <w:sz w:val="20"/>
+          <w:szCs w:val="20"/>
+          <w:highlight w:val="none"/>
+        </w:rPr>
+      </w:r>
+    </w:p>
+    <w:p>
+      <w:pPr>
+        <w:pStyle w:val="139"/>
+        <w:pBdr>
+          <w:top w:val="none" w:color="000000" w:sz="4" w:space="0"/>
+          <w:left w:val="none" w:color="000000" w:sz="4" w:space="0"/>
+          <w:bottom w:val="none" w:color="000000" w:sz="4" w:space="0"/>
+          <w:right w:val="none" w:color="000000" w:sz="4" w:space="0"/>
+        </w:pBdr>
+        <w:spacing/>
+        <w:ind w:right="0" w:firstLine="0" w:left="0"/>
+        <w:rPr>
+          <w:rFonts w:ascii="Open Sans" w:hAnsi="Open Sans" w:eastAsia="Open Sans" w:cs="Open Sans"/>
+          <w:b/>
+          <w:bCs/>
+          <w:color w:val="000000"/>
+          <w:sz w:val="20"/>
+          <w:szCs w:val="20"/>
+          <w:highlight w:val="none"/>
+        </w:rPr>
+      </w:pPr>
+      <w:r>
+        <w:rPr>
+          <w:rFonts w:ascii="Open Sans" w:hAnsi="Open Sans" w:eastAsia="Open Sans" w:cs="Open Sans"/>
+          <w:b/>
+          <w:bCs/>
+          <w:color w:val="000000"/>
+          <w:sz w:val="20"/>
+          <w:szCs w:val="20"/>
+          <w:highlight w:val="none"/>
+        </w:rPr>
+      </w:r>
+      <w:r>
+        <w:rPr>
+          <w:rFonts w:ascii="Open Sans" w:hAnsi="Open Sans" w:eastAsia="Open Sans" w:cs="Open Sans"/>
+          <w:b/>
+          <w:bCs/>
+          <w:color w:val="000000"/>
+          <w:sz w:val="20"/>
+          <w:szCs w:val="20"/>
+          <w:highlight w:val="none"/>
+        </w:rPr>
+      </w:r>
+    </w:p>
+    <w:p>
+      <w:pPr>
+        <w:pStyle w:val="139"/>
+        <w:pBdr>
+          <w:top w:val="none" w:color="000000" w:sz="4" w:space="0"/>
+          <w:left w:val="none" w:color="000000" w:sz="4" w:space="0"/>
+          <w:bottom w:val="none" w:color="000000" w:sz="4" w:space="0"/>
+          <w:right w:val="none" w:color="000000" w:sz="4" w:space="0"/>
+        </w:pBdr>
+        <w:spacing/>
+        <w:ind w:right="0" w:firstLine="0" w:left="0"/>
+        <w:rPr>
+          <w:rFonts w:ascii="Open Sans" w:hAnsi="Open Sans" w:eastAsia="Open Sans" w:cs="Open Sans"/>
+          <w:b/>
+          <w:bCs/>
+          <w:color w:val="000000"/>
+          <w:sz w:val="20"/>
+          <w:szCs w:val="20"/>
+          <w:highlight w:val="none"/>
+        </w:rPr>
+      </w:pPr>
+      <w:r>
+        <w:rPr>
+          <w:rFonts w:ascii="Open Sans" w:hAnsi="Open Sans" w:eastAsia="Open Sans" w:cs="Open Sans"/>
+          <w:b/>
+          <w:bCs/>
+          <w:color w:val="000000"/>
+          <w:sz w:val="20"/>
+          <w:szCs w:val="20"/>
+          <w:highlight w:val="none"/>
+        </w:rPr>
+      </w:r>
+      <w:r>
+        <w:rPr>
+          <w:rFonts w:ascii="Open Sans" w:hAnsi="Open Sans" w:eastAsia="Open Sans" w:cs="Open Sans"/>
+          <w:b/>
+          <w:bCs/>
+          <w:color w:val="000000"/>
+          <w:sz w:val="20"/>
+          <w:szCs w:val="20"/>
+          <w:highlight w:val="none"/>
+        </w:rPr>
+      </w:r>
+    </w:p>
+    <w:p>
+      <w:pPr>
+        <w:pStyle w:val="139"/>
+        <w:pBdr>
+          <w:top w:val="none" w:color="000000" w:sz="4" w:space="0"/>
+          <w:left w:val="none" w:color="000000" w:sz="4" w:space="0"/>
+          <w:bottom w:val="none" w:color="000000" w:sz="4" w:space="0"/>
+          <w:right w:val="none" w:color="000000" w:sz="4" w:space="0"/>
+        </w:pBdr>
+        <w:spacing/>
+        <w:ind w:right="0" w:firstLine="0" w:left="0"/>
+        <w:rPr>
+          <w:rFonts w:ascii="Open Sans" w:hAnsi="Open Sans" w:eastAsia="Open Sans" w:cs="Open Sans"/>
+          <w:b/>
+          <w:bCs/>
+          <w:color w:val="000000"/>
+          <w:sz w:val="20"/>
+          <w:szCs w:val="20"/>
+          <w:highlight w:val="none"/>
+        </w:rPr>
+      </w:pPr>
+      <w:r>
+        <w:rPr>
+          <w:rFonts w:ascii="Open Sans" w:hAnsi="Open Sans" w:eastAsia="Open Sans" w:cs="Open Sans"/>
+          <w:b/>
+          <w:bCs/>
+          <w:color w:val="000000"/>
+          <w:sz w:val="20"/>
+          <w:szCs w:val="20"/>
+          <w:highlight w:val="none"/>
+        </w:rPr>
+      </w:r>
+      <w:r>
+        <w:rPr>
+          <w:rFonts w:ascii="Open Sans" w:hAnsi="Open Sans" w:eastAsia="Open Sans" w:cs="Open Sans"/>
+          <w:b/>
+          <w:bCs/>
+          <w:color w:val="000000"/>
+          <w:sz w:val="20"/>
+          <w:szCs w:val="20"/>
+          <w:highlight w:val="none"/>
+        </w:rPr>
+      </w:r>
+    </w:p>
+    <w:p>
+      <w:pPr>
+        <w:pBdr/>
+        <w:spacing/>
+        <w:ind/>
+        <w:rPr/>
+      </w:pPr>
+      <w:r/>
+      <w:r/>
+    </w:p>
+    <w:p>
+      <w:pPr>
+        <w:pStyle w:val="139"/>
+        <w:pBdr>
+          <w:top w:val="none" w:color="000000" w:sz="4" w:space="0"/>
+          <w:left w:val="none" w:color="000000" w:sz="4" w:space="0"/>
+          <w:bottom w:val="none" w:color="000000" w:sz="4" w:space="0"/>
+          <w:right w:val="none" w:color="000000" w:sz="4" w:space="0"/>
+        </w:pBdr>
+        <w:spacing/>
+        <w:ind w:right="0" w:firstLine="0" w:left="0"/>
+        <w:rPr>
+          <w:rFonts w:ascii="Open Sans" w:hAnsi="Open Sans" w:eastAsia="Open Sans" w:cs="Open Sans"/>
+          <w:b/>
+          <w:bCs/>
+          <w:color w:val="000000"/>
+          <w:sz w:val="20"/>
+          <w:szCs w:val="20"/>
+          <w:highlight w:val="none"/>
         </w:rPr>
       </w:pPr>
       <w:r>
@@ -1650,6 +2810,48 @@
           <w:color w:val="000000"/>
           <w:sz w:val="20"/>
           <w:szCs w:val="20"/>
+          <w:highlight w:val="none"/>
+        </w:rPr>
+      </w:r>
+      <w:r>
+        <w:rPr>
+          <w:rFonts w:ascii="Open Sans" w:hAnsi="Open Sans" w:eastAsia="Open Sans" w:cs="Open Sans"/>
+          <w:b/>
+          <w:color w:val="000000"/>
+          <w:sz w:val="20"/>
+          <w:szCs w:val="20"/>
+          <w:highlight w:val="none"/>
+        </w:rPr>
+      </w:r>
+    </w:p>
+    <w:p>
+      <w:pPr>
+        <w:pStyle w:val="139"/>
+        <w:pBdr>
+          <w:top w:val="none" w:color="000000" w:sz="4" w:space="0"/>
+          <w:left w:val="none" w:color="000000" w:sz="4" w:space="0"/>
+          <w:bottom w:val="none" w:color="000000" w:sz="4" w:space="0"/>
+          <w:right w:val="none" w:color="000000" w:sz="4" w:space="0"/>
+        </w:pBdr>
+        <w:spacing/>
+        <w:ind w:right="0" w:firstLine="0" w:left="0"/>
+        <w:rPr>
+          <w:rFonts w:ascii="Open Sans" w:hAnsi="Open Sans" w:eastAsia="Open Sans" w:cs="Open Sans"/>
+          <w:b/>
+          <w:bCs/>
+          <w:color w:val="000000"/>
+          <w:sz w:val="20"/>
+          <w:szCs w:val="20"/>
+          <w:highlight w:val="none"/>
+        </w:rPr>
+      </w:pPr>
+      <w:r>
+        <w:rPr>
+          <w:rFonts w:ascii="Open Sans" w:hAnsi="Open Sans" w:eastAsia="Open Sans" w:cs="Open Sans"/>
+          <w:b/>
+          <w:color w:val="000000"/>
+          <w:sz w:val="20"/>
+          <w:szCs w:val="20"/>
         </w:rPr>
         <w:t xml:space="preserve">5. Entrenamiento del Modelo</w:t>
       </w:r>
@@ -2628,9 +3830,11 @@
         <w:spacing/>
         <w:ind w:right="0" w:firstLine="0" w:left="0"/>
         <w:rPr>
-          <w:rFonts w:ascii="Open Sans" w:hAnsi="Open Sans" w:cs="Open Sans"/>
+          <w:rFonts w:ascii="Open Sans" w:hAnsi="Open Sans" w:eastAsia="Open Sans" w:cs="Open Sans"/>
+          <w:color w:val="000000"/>
           <w:sz w:val="20"/>
           <w:szCs w:val="20"/>
+          <w:highlight w:val="none"/>
         </w:rPr>
       </w:pPr>
       <w:r>
@@ -2652,7 +3856,6 @@
     </w:p>
     <w:p>
       <w:pPr>
-        <w:pStyle w:val="139"/>
         <w:pBdr>
           <w:top w:val="none" w:color="000000" w:sz="4" w:space="0"/>
           <w:left w:val="none" w:color="000000" w:sz="4" w:space="0"/>
@@ -2670,84 +3873,11 @@
       <w:r>
         <w:rPr>
           <w:rFonts w:ascii="Open Sans" w:hAnsi="Open Sans" w:eastAsia="Open Sans" w:cs="Open Sans"/>
-          <w:b/>
           <w:color w:val="000000"/>
           <w:sz w:val="20"/>
           <w:szCs w:val="20"/>
+          <w:highlight w:val="none"/>
         </w:rPr>
-        <w:t xml:space="preserve">8. Conclusión y Posibles Mejoras Futuras</w:t>
-      </w:r>
-      <w:r>
-        <w:rPr>
-          <w:rFonts w:ascii="Open Sans" w:hAnsi="Open Sans" w:eastAsia="Open Sans" w:cs="Open Sans"/>
-          <w:sz w:val="20"/>
-          <w:szCs w:val="20"/>
-        </w:rPr>
-      </w:r>
-    </w:p>
-    <w:p>
-      <w:pPr>
-        <w:pBdr>
-          <w:top w:val="none" w:color="000000" w:sz="4" w:space="0"/>
-          <w:left w:val="none" w:color="000000" w:sz="4" w:space="0"/>
-          <w:bottom w:val="none" w:color="000000" w:sz="4" w:space="0"/>
-          <w:right w:val="none" w:color="000000" w:sz="4" w:space="0"/>
-        </w:pBdr>
-        <w:spacing/>
-        <w:ind w:right="0" w:firstLine="0" w:left="0"/>
-        <w:rPr>
-          <w:rFonts w:ascii="Open Sans" w:hAnsi="Open Sans" w:cs="Open Sans"/>
-          <w:sz w:val="20"/>
-          <w:szCs w:val="20"/>
-        </w:rPr>
-      </w:pPr>
-      <w:r>
-        <w:rPr>
-          <w:rFonts w:ascii="Open Sans" w:hAnsi="Open Sans" w:eastAsia="Open Sans" w:cs="Open Sans"/>
-          <w:color w:val="000000"/>
-          <w:sz w:val="20"/>
-          <w:szCs w:val="20"/>
-        </w:rPr>
-        <w:t xml:space="preserve">El proyecto permitió desarrollar un modelo de CNN que logra clasificar las imágenes de frutas en las seis categorías definidas. Los pasos más importantes fueron:</w:t>
-      </w:r>
-      <w:r>
-        <w:rPr>
-          <w:rFonts w:ascii="Open Sans" w:hAnsi="Open Sans" w:eastAsia="Open Sans" w:cs="Open Sans"/>
-          <w:sz w:val="20"/>
-          <w:szCs w:val="20"/>
-        </w:rPr>
-      </w:r>
-    </w:p>
-    <w:p>
-      <w:pPr>
-        <w:pStyle w:val="664"/>
-        <w:numPr>
-          <w:ilvl w:val="0"/>
-          <w:numId w:val="8"/>
-        </w:numPr>
-        <w:pBdr>
-          <w:top w:val="none" w:color="000000" w:sz="4" w:space="0"/>
-          <w:left w:val="none" w:color="000000" w:sz="4" w:space="0"/>
-          <w:bottom w:val="none" w:color="000000" w:sz="4" w:space="0"/>
-          <w:right w:val="none" w:color="000000" w:sz="4" w:space="0"/>
-        </w:pBdr>
-        <w:spacing/>
-        <w:ind w:right="0"/>
-        <w:rPr>
-          <w:rFonts w:ascii="Open Sans" w:hAnsi="Open Sans" w:cs="Open Sans"/>
-          <w:sz w:val="20"/>
-          <w:szCs w:val="20"/>
-        </w:rPr>
-      </w:pPr>
-      <w:r>
-        <w:rPr>
-          <w:rFonts w:ascii="Open Sans" w:hAnsi="Open Sans" w:eastAsia="Open Sans" w:cs="Open Sans"/>
-          <w:b/>
-          <w:color w:val="000000"/>
-          <w:sz w:val="20"/>
-          <w:szCs w:val="20"/>
-        </w:rPr>
-        <w:t xml:space="preserve">Preprocesamiento:</w:t>
       </w:r>
       <w:r>
         <w:rPr>
@@ -2755,716 +3885,19 @@
           <w:color w:val="000000"/>
           <w:sz w:val="20"/>
           <w:szCs w:val="20"/>
-        </w:rPr>
-        <w:t xml:space="preserve"> Se cargaron y transformaron las imágenes, aplicándose técnicas de data augmentation para mejorar la robustez del modelo.</w:t>
-      </w:r>
-      <w:r>
-        <w:rPr>
-          <w:rFonts w:ascii="Open Sans" w:hAnsi="Open Sans" w:eastAsia="Open Sans" w:cs="Open Sans"/>
-          <w:sz w:val="20"/>
-          <w:szCs w:val="20"/>
+          <w:highlight w:val="none"/>
         </w:rPr>
       </w:r>
     </w:p>
     <w:p>
       <w:pPr>
-        <w:pStyle w:val="664"/>
-        <w:numPr>
-          <w:ilvl w:val="0"/>
-          <w:numId w:val="8"/>
-        </w:numPr>
-        <w:pBdr>
-          <w:top w:val="none" w:color="000000" w:sz="4" w:space="0"/>
-          <w:left w:val="none" w:color="000000" w:sz="4" w:space="0"/>
-          <w:bottom w:val="none" w:color="000000" w:sz="4" w:space="0"/>
-          <w:right w:val="none" w:color="000000" w:sz="4" w:space="0"/>
-        </w:pBdr>
-        <w:spacing/>
-        <w:ind w:right="0"/>
-        <w:rPr>
-          <w:rFonts w:ascii="Open Sans" w:hAnsi="Open Sans" w:cs="Open Sans"/>
-          <w:sz w:val="20"/>
-          <w:szCs w:val="20"/>
-        </w:rPr>
-      </w:pPr>
-      <w:r>
-        <w:rPr>
-          <w:rFonts w:ascii="Open Sans" w:hAnsi="Open Sans" w:eastAsia="Open Sans" w:cs="Open Sans"/>
-          <w:b/>
-          <w:color w:val="000000"/>
-          <w:sz w:val="20"/>
-          <w:szCs w:val="20"/>
-        </w:rPr>
-        <w:t xml:space="preserve">Definición del Modelo:</w:t>
-      </w:r>
-      <w:r>
-        <w:rPr>
-          <w:rFonts w:ascii="Open Sans" w:hAnsi="Open Sans" w:eastAsia="Open Sans" w:cs="Open Sans"/>
-          <w:color w:val="000000"/>
-          <w:sz w:val="20"/>
-          <w:szCs w:val="20"/>
-        </w:rPr>
-        <w:t xml:space="preserve"> Se diseñó una arquitectura CNN sencilla, pero efectiva, utilizando capas convolucionales y densas.</w:t>
-      </w:r>
-      <w:r>
-        <w:rPr>
-          <w:rFonts w:ascii="Open Sans" w:hAnsi="Open Sans" w:eastAsia="Open Sans" w:cs="Open Sans"/>
-          <w:sz w:val="20"/>
-          <w:szCs w:val="20"/>
-        </w:rPr>
-      </w:r>
-    </w:p>
-    <w:p>
-      <w:pPr>
-        <w:pStyle w:val="664"/>
-        <w:numPr>
-          <w:ilvl w:val="0"/>
-          <w:numId w:val="8"/>
-        </w:numPr>
-        <w:pBdr>
-          <w:top w:val="none" w:color="000000" w:sz="4" w:space="0"/>
-          <w:left w:val="none" w:color="000000" w:sz="4" w:space="0"/>
-          <w:bottom w:val="none" w:color="000000" w:sz="4" w:space="0"/>
-          <w:right w:val="none" w:color="000000" w:sz="4" w:space="0"/>
-        </w:pBdr>
-        <w:spacing/>
-        <w:ind w:right="0"/>
-        <w:rPr>
-          <w:rFonts w:ascii="Open Sans" w:hAnsi="Open Sans" w:cs="Open Sans"/>
-          <w:sz w:val="20"/>
-          <w:szCs w:val="20"/>
-        </w:rPr>
-      </w:pPr>
-      <w:r>
-        <w:rPr>
-          <w:rFonts w:ascii="Open Sans" w:hAnsi="Open Sans" w:eastAsia="Open Sans" w:cs="Open Sans"/>
-          <w:b/>
-          <w:color w:val="000000"/>
-          <w:sz w:val="20"/>
-          <w:szCs w:val="20"/>
-        </w:rPr>
-        <w:t xml:space="preserve">Entrenamiento y Validación:</w:t>
-      </w:r>
-      <w:r>
-        <w:rPr>
-          <w:rFonts w:ascii="Open Sans" w:hAnsi="Open Sans" w:eastAsia="Open Sans" w:cs="Open Sans"/>
-          <w:color w:val="000000"/>
-          <w:sz w:val="20"/>
-          <w:szCs w:val="20"/>
-        </w:rPr>
-        <w:t xml:space="preserve"> Se realizó un entrenamiento con control de early stopping para prevenir sobreajuste, y se ajustaron hiperparámetros claves.</w:t>
-      </w:r>
-      <w:r>
-        <w:rPr>
-          <w:rFonts w:ascii="Open Sans" w:hAnsi="Open Sans" w:eastAsia="Open Sans" w:cs="Open Sans"/>
-          <w:sz w:val="20"/>
-          <w:szCs w:val="20"/>
-        </w:rPr>
-      </w:r>
-    </w:p>
-    <w:p>
-      <w:pPr>
-        <w:pStyle w:val="664"/>
-        <w:numPr>
-          <w:ilvl w:val="0"/>
-          <w:numId w:val="8"/>
-        </w:numPr>
-        <w:pBdr>
-          <w:top w:val="none" w:color="000000" w:sz="4" w:space="0"/>
-          <w:left w:val="none" w:color="000000" w:sz="4" w:space="0"/>
-          <w:bottom w:val="none" w:color="000000" w:sz="4" w:space="0"/>
-          <w:right w:val="none" w:color="000000" w:sz="4" w:space="0"/>
-        </w:pBdr>
-        <w:spacing/>
-        <w:ind w:right="0"/>
-        <w:rPr>
-          <w:rFonts w:ascii="Open Sans" w:hAnsi="Open Sans" w:cs="Open Sans"/>
-          <w:sz w:val="20"/>
-          <w:szCs w:val="20"/>
-        </w:rPr>
-      </w:pPr>
-      <w:r>
-        <w:rPr>
-          <w:rFonts w:ascii="Open Sans" w:hAnsi="Open Sans" w:eastAsia="Open Sans" w:cs="Open Sans"/>
-          <w:b/>
-          <w:color w:val="000000"/>
-          <w:sz w:val="20"/>
-          <w:szCs w:val="20"/>
-        </w:rPr>
-        <w:t xml:space="preserve">Evaluación:</w:t>
-      </w:r>
-      <w:r>
-        <w:rPr>
-          <w:rFonts w:ascii="Open Sans" w:hAnsi="Open Sans" w:eastAsia="Open Sans" w:cs="Open Sans"/>
-          <w:color w:val="000000"/>
-          <w:sz w:val="20"/>
-          <w:szCs w:val="20"/>
-        </w:rPr>
-        <w:t xml:space="preserve"> Se midió el rendimiento del modelo en datos no vistos, utilizando métricas comunes y visualizaciones para identificar áreas de mejora.</w:t>
-      </w:r>
-      <w:r>
-        <w:rPr>
-          <w:rFonts w:ascii="Open Sans" w:hAnsi="Open Sans" w:eastAsia="Open Sans" w:cs="Open Sans"/>
-          <w:sz w:val="20"/>
-          <w:szCs w:val="20"/>
-        </w:rPr>
-      </w:r>
-    </w:p>
-    <w:p>
-      <w:pPr>
-        <w:pStyle w:val="140"/>
-        <w:pBdr>
-          <w:top w:val="none" w:color="000000" w:sz="4" w:space="0"/>
-          <w:left w:val="none" w:color="000000" w:sz="4" w:space="0"/>
-          <w:bottom w:val="none" w:color="000000" w:sz="4" w:space="0"/>
-          <w:right w:val="none" w:color="000000" w:sz="4" w:space="0"/>
-        </w:pBdr>
-        <w:spacing/>
-        <w:ind w:right="0" w:firstLine="0" w:left="0"/>
-        <w:rPr>
-          <w:rFonts w:ascii="Open Sans" w:hAnsi="Open Sans" w:cs="Open Sans"/>
-          <w:sz w:val="20"/>
-          <w:szCs w:val="20"/>
-        </w:rPr>
-      </w:pPr>
-      <w:r>
-        <w:rPr>
-          <w:rFonts w:ascii="Open Sans" w:hAnsi="Open Sans" w:eastAsia="Open Sans" w:cs="Open Sans"/>
-          <w:b/>
-          <w:color w:val="000000"/>
-          <w:sz w:val="20"/>
-          <w:szCs w:val="20"/>
-        </w:rPr>
-        <w:t xml:space="preserve">Mejora y Trabajo Futuro</w:t>
-      </w:r>
-      <w:r>
-        <w:rPr>
-          <w:rFonts w:ascii="Open Sans" w:hAnsi="Open Sans" w:eastAsia="Open Sans" w:cs="Open Sans"/>
-          <w:sz w:val="20"/>
-          <w:szCs w:val="20"/>
-        </w:rPr>
-      </w:r>
-    </w:p>
-    <w:p>
-      <w:pPr>
-        <w:pStyle w:val="664"/>
-        <w:numPr>
-          <w:ilvl w:val="0"/>
-          <w:numId w:val="9"/>
-        </w:numPr>
-        <w:pBdr>
-          <w:top w:val="none" w:color="000000" w:sz="4" w:space="0"/>
-          <w:left w:val="none" w:color="000000" w:sz="4" w:space="0"/>
-          <w:bottom w:val="none" w:color="000000" w:sz="4" w:space="0"/>
-          <w:right w:val="none" w:color="000000" w:sz="4" w:space="0"/>
-        </w:pBdr>
-        <w:spacing/>
-        <w:ind w:right="0"/>
-        <w:rPr>
-          <w:rFonts w:ascii="Open Sans" w:hAnsi="Open Sans" w:cs="Open Sans"/>
-          <w:sz w:val="20"/>
-          <w:szCs w:val="20"/>
-        </w:rPr>
-      </w:pPr>
-      <w:r>
-        <w:rPr>
-          <w:rFonts w:ascii="Open Sans" w:hAnsi="Open Sans" w:eastAsia="Open Sans" w:cs="Open Sans"/>
-          <w:b/>
-          <w:color w:val="000000"/>
-          <w:sz w:val="20"/>
-          <w:szCs w:val="20"/>
-        </w:rPr>
-        <w:t xml:space="preserve">Transfer Learning:</w:t>
-      </w:r>
-      <w:r>
-        <w:rPr>
-          <w:rFonts w:ascii="Open Sans" w:hAnsi="Open Sans" w:eastAsia="Open Sans" w:cs="Open Sans"/>
-          <w:color w:val="000000"/>
-          <w:sz w:val="20"/>
-          <w:szCs w:val="20"/>
-        </w:rPr>
-        <w:t xml:space="preserve"> Una posible mejora es utilizar modelos preentrenados como ResNet o VGG, que pueden mejorar la precisión al aprovechar características aprendidas en grandes datasets.</w:t>
-      </w:r>
-      <w:r>
-        <w:rPr>
-          <w:rFonts w:ascii="Open Sans" w:hAnsi="Open Sans" w:eastAsia="Open Sans" w:cs="Open Sans"/>
-          <w:sz w:val="20"/>
-          <w:szCs w:val="20"/>
-        </w:rPr>
-      </w:r>
-    </w:p>
-    <w:p>
-      <w:pPr>
-        <w:pStyle w:val="664"/>
-        <w:numPr>
-          <w:ilvl w:val="0"/>
-          <w:numId w:val="9"/>
-        </w:numPr>
-        <w:pBdr>
-          <w:top w:val="none" w:color="000000" w:sz="4" w:space="0"/>
-          <w:left w:val="none" w:color="000000" w:sz="4" w:space="0"/>
-          <w:bottom w:val="none" w:color="000000" w:sz="4" w:space="0"/>
-          <w:right w:val="none" w:color="000000" w:sz="4" w:space="0"/>
-        </w:pBdr>
-        <w:spacing/>
-        <w:ind w:right="0"/>
-        <w:rPr>
-          <w:rFonts w:ascii="Open Sans" w:hAnsi="Open Sans" w:cs="Open Sans"/>
-          <w:sz w:val="20"/>
-          <w:szCs w:val="20"/>
-        </w:rPr>
-      </w:pPr>
-      <w:r>
-        <w:rPr>
-          <w:rFonts w:ascii="Open Sans" w:hAnsi="Open Sans" w:eastAsia="Open Sans" w:cs="Open Sans"/>
-          <w:b/>
-          <w:color w:val="000000"/>
-          <w:sz w:val="20"/>
-          <w:szCs w:val="20"/>
-        </w:rPr>
-        <w:t xml:space="preserve">Ajuste Fino de Hiperparámetros:</w:t>
-      </w:r>
-      <w:r>
-        <w:rPr>
-          <w:rFonts w:ascii="Open Sans" w:hAnsi="Open Sans" w:eastAsia="Open Sans" w:cs="Open Sans"/>
-          <w:color w:val="000000"/>
-          <w:sz w:val="20"/>
-          <w:szCs w:val="20"/>
-        </w:rPr>
-        <w:t xml:space="preserve"> Realizar búsquedas más exhaustivas (por ejemplo, GridSearch o RandomSearch) para encontrar el conjunto óptimo de hiperparámetros.</w:t>
-      </w:r>
-      <w:r>
-        <w:rPr>
-          <w:rFonts w:ascii="Open Sans" w:hAnsi="Open Sans" w:eastAsia="Open Sans" w:cs="Open Sans"/>
-          <w:sz w:val="20"/>
-          <w:szCs w:val="20"/>
-        </w:rPr>
-      </w:r>
-    </w:p>
-    <w:p>
-      <w:pPr>
-        <w:pStyle w:val="664"/>
-        <w:numPr>
-          <w:ilvl w:val="0"/>
-          <w:numId w:val="9"/>
-        </w:numPr>
-        <w:pBdr>
-          <w:top w:val="none" w:color="000000" w:sz="4" w:space="0"/>
-          <w:left w:val="none" w:color="000000" w:sz="4" w:space="0"/>
-          <w:bottom w:val="none" w:color="000000" w:sz="4" w:space="0"/>
-          <w:right w:val="none" w:color="000000" w:sz="4" w:space="0"/>
-        </w:pBdr>
-        <w:spacing/>
-        <w:ind w:right="0"/>
-        <w:rPr>
-          <w:rFonts w:ascii="Open Sans" w:hAnsi="Open Sans" w:cs="Open Sans"/>
-          <w:sz w:val="20"/>
-          <w:szCs w:val="20"/>
-        </w:rPr>
-      </w:pPr>
-      <w:r>
-        <w:rPr>
-          <w:rFonts w:ascii="Open Sans" w:hAnsi="Open Sans" w:eastAsia="Open Sans" w:cs="Open Sans"/>
-          <w:b/>
-          <w:color w:val="000000"/>
-          <w:sz w:val="20"/>
-          <w:szCs w:val="20"/>
-        </w:rPr>
-        <w:t xml:space="preserve">Incremento del Dataset:</w:t>
-      </w:r>
-      <w:r>
-        <w:rPr>
-          <w:rFonts w:ascii="Open Sans" w:hAnsi="Open Sans" w:eastAsia="Open Sans" w:cs="Open Sans"/>
-          <w:color w:val="000000"/>
-          <w:sz w:val="20"/>
-          <w:szCs w:val="20"/>
-        </w:rPr>
-        <w:t xml:space="preserve"> Si es posible, ampliar el número de imágenes por clase o incluir datos adicionales para mejorar la generalización del modelo.</w:t>
-      </w:r>
-      <w:r>
-        <w:rPr>
-          <w:rFonts w:ascii="Open Sans" w:hAnsi="Open Sans" w:eastAsia="Open Sans" w:cs="Open Sans"/>
-          <w:sz w:val="20"/>
-          <w:szCs w:val="20"/>
-        </w:rPr>
-      </w:r>
-    </w:p>
-    <w:p>
-      <w:pPr>
-        <w:pStyle w:val="664"/>
-        <w:numPr>
-          <w:ilvl w:val="0"/>
-          <w:numId w:val="9"/>
-        </w:numPr>
-        <w:pBdr>
-          <w:top w:val="none" w:color="000000" w:sz="4" w:space="0"/>
-          <w:left w:val="none" w:color="000000" w:sz="4" w:space="0"/>
-          <w:bottom w:val="none" w:color="000000" w:sz="4" w:space="0"/>
-          <w:right w:val="none" w:color="000000" w:sz="4" w:space="0"/>
-        </w:pBdr>
-        <w:spacing/>
-        <w:ind w:right="0"/>
-        <w:rPr>
-          <w:rFonts w:ascii="Open Sans" w:hAnsi="Open Sans" w:cs="Open Sans"/>
-          <w:sz w:val="20"/>
-          <w:szCs w:val="20"/>
-        </w:rPr>
-      </w:pPr>
-      <w:r>
-        <w:rPr>
-          <w:rFonts w:ascii="Open Sans" w:hAnsi="Open Sans" w:eastAsia="Open Sans" w:cs="Open Sans"/>
-          <w:b/>
-          <w:color w:val="000000"/>
-          <w:sz w:val="20"/>
-          <w:szCs w:val="20"/>
-        </w:rPr>
-        <w:t xml:space="preserve">Análisis de Errores:</w:t>
-      </w:r>
-      <w:r>
-        <w:rPr>
-          <w:rFonts w:ascii="Open Sans" w:hAnsi="Open Sans" w:eastAsia="Open Sans" w:cs="Open Sans"/>
-          <w:color w:val="000000"/>
-          <w:sz w:val="20"/>
-          <w:szCs w:val="20"/>
-        </w:rPr>
-        <w:t xml:space="preserve"> Investigar más a fondo las imágenes mal clasificadas, implementando técnicas adicionales de preprocesamiento o refinamiento en la arquitectura.</w:t>
-      </w:r>
-      <w:r>
-        <w:rPr>
-          <w:rFonts w:ascii="Open Sans" w:hAnsi="Open Sans" w:eastAsia="Open Sans" w:cs="Open Sans"/>
-          <w:sz w:val="20"/>
-          <w:szCs w:val="20"/>
-        </w:rPr>
-      </w:r>
-    </w:p>
-    <w:p>
-      <w:pPr>
-        <w:pStyle w:val="139"/>
-        <w:pBdr>
-          <w:top w:val="none" w:color="000000" w:sz="4" w:space="0"/>
-          <w:left w:val="none" w:color="000000" w:sz="4" w:space="0"/>
-          <w:bottom w:val="none" w:color="000000" w:sz="4" w:space="0"/>
-          <w:right w:val="none" w:color="000000" w:sz="4" w:space="0"/>
-        </w:pBdr>
-        <w:spacing/>
-        <w:ind w:right="0" w:firstLine="0" w:left="0"/>
-        <w:rPr>
-          <w:rFonts w:ascii="Open Sans" w:hAnsi="Open Sans" w:cs="Open Sans"/>
-          <w:sz w:val="20"/>
-          <w:szCs w:val="20"/>
-        </w:rPr>
-      </w:pPr>
-      <w:r>
-        <w:rPr>
-          <w:rFonts w:ascii="Open Sans" w:hAnsi="Open Sans" w:eastAsia="Open Sans" w:cs="Open Sans"/>
-          <w:b/>
-          <w:color w:val="000000"/>
-          <w:sz w:val="20"/>
-          <w:szCs w:val="20"/>
-        </w:rPr>
-        <w:t xml:space="preserve">9. Documentación y Presentación</w:t>
-      </w:r>
-      <w:r>
-        <w:rPr>
-          <w:rFonts w:ascii="Open Sans" w:hAnsi="Open Sans" w:eastAsia="Open Sans" w:cs="Open Sans"/>
-          <w:sz w:val="20"/>
-          <w:szCs w:val="20"/>
-        </w:rPr>
-      </w:r>
-    </w:p>
-    <w:p>
-      <w:pPr>
-        <w:pBdr>
-          <w:top w:val="none" w:color="000000" w:sz="4" w:space="0"/>
-          <w:left w:val="none" w:color="000000" w:sz="4" w:space="0"/>
-          <w:bottom w:val="none" w:color="000000" w:sz="4" w:space="0"/>
-          <w:right w:val="none" w:color="000000" w:sz="4" w:space="0"/>
-        </w:pBdr>
-        <w:spacing/>
-        <w:ind w:right="0" w:firstLine="0" w:left="0"/>
-        <w:rPr>
-          <w:rFonts w:ascii="Open Sans" w:hAnsi="Open Sans" w:cs="Open Sans"/>
-          <w:sz w:val="20"/>
-          <w:szCs w:val="20"/>
-        </w:rPr>
-      </w:pPr>
-      <w:r>
-        <w:rPr>
-          <w:rFonts w:ascii="Open Sans" w:hAnsi="Open Sans" w:eastAsia="Open Sans" w:cs="Open Sans"/>
-          <w:color w:val="000000"/>
-          <w:sz w:val="20"/>
-          <w:szCs w:val="20"/>
-        </w:rPr>
-        <w:t xml:space="preserve">El reporte resumido y el código desarrollado se pueden integrar en una presentación (por ejemplo, en un PowerPoint o un Jupyter Notebook) que incluya:</w:t>
-      </w:r>
-      <w:r>
-        <w:rPr>
-          <w:rFonts w:ascii="Open Sans" w:hAnsi="Open Sans" w:eastAsia="Open Sans" w:cs="Open Sans"/>
-          <w:sz w:val="20"/>
-          <w:szCs w:val="20"/>
-        </w:rPr>
-      </w:r>
-    </w:p>
-    <w:p>
-      <w:pPr>
-        <w:pStyle w:val="664"/>
-        <w:numPr>
-          <w:ilvl w:val="0"/>
-          <w:numId w:val="10"/>
-        </w:numPr>
-        <w:pBdr>
-          <w:top w:val="none" w:color="000000" w:sz="4" w:space="0"/>
-          <w:left w:val="none" w:color="000000" w:sz="4" w:space="0"/>
-          <w:bottom w:val="none" w:color="000000" w:sz="4" w:space="0"/>
-          <w:right w:val="none" w:color="000000" w:sz="4" w:space="0"/>
-        </w:pBdr>
-        <w:spacing/>
-        <w:ind w:right="0"/>
-        <w:rPr>
-          <w:rFonts w:ascii="Open Sans" w:hAnsi="Open Sans" w:cs="Open Sans"/>
-          <w:sz w:val="20"/>
-          <w:szCs w:val="20"/>
-        </w:rPr>
-      </w:pPr>
-      <w:r>
-        <w:rPr>
-          <w:rFonts w:ascii="Open Sans" w:hAnsi="Open Sans" w:eastAsia="Open Sans" w:cs="Open Sans"/>
-          <w:b/>
-          <w:color w:val="000000"/>
-          <w:sz w:val="20"/>
-          <w:szCs w:val="20"/>
-        </w:rPr>
-        <w:t xml:space="preserve">Gráficos:</w:t>
-      </w:r>
-      <w:r>
-        <w:rPr>
-          <w:rFonts w:ascii="Open Sans" w:hAnsi="Open Sans" w:eastAsia="Open Sans" w:cs="Open Sans"/>
-          <w:color w:val="000000"/>
-          <w:sz w:val="20"/>
-          <w:szCs w:val="20"/>
-        </w:rPr>
-        <w:t xml:space="preserve"> Evolución de la pérdida y exactitud, distribución de las clases y ejemplos de predicciones exitosas y erróneas.</w:t>
-      </w:r>
-      <w:r>
-        <w:rPr>
-          <w:rFonts w:ascii="Open Sans" w:hAnsi="Open Sans" w:eastAsia="Open Sans" w:cs="Open Sans"/>
-          <w:sz w:val="20"/>
-          <w:szCs w:val="20"/>
-        </w:rPr>
-      </w:r>
-    </w:p>
-    <w:p>
-      <w:pPr>
-        <w:pStyle w:val="664"/>
-        <w:numPr>
-          <w:ilvl w:val="0"/>
-          <w:numId w:val="10"/>
-        </w:numPr>
-        <w:pBdr>
-          <w:top w:val="none" w:color="000000" w:sz="4" w:space="0"/>
-          <w:left w:val="none" w:color="000000" w:sz="4" w:space="0"/>
-          <w:bottom w:val="none" w:color="000000" w:sz="4" w:space="0"/>
-          <w:right w:val="none" w:color="000000" w:sz="4" w:space="0"/>
-        </w:pBdr>
-        <w:spacing/>
-        <w:ind w:right="0"/>
-        <w:rPr>
-          <w:rFonts w:ascii="Open Sans" w:hAnsi="Open Sans" w:cs="Open Sans"/>
-          <w:sz w:val="20"/>
-          <w:szCs w:val="20"/>
-        </w:rPr>
-      </w:pPr>
-      <w:r>
-        <w:rPr>
-          <w:rFonts w:ascii="Open Sans" w:hAnsi="Open Sans" w:eastAsia="Open Sans" w:cs="Open Sans"/>
-          <w:b/>
-          <w:color w:val="000000"/>
-          <w:sz w:val="20"/>
-          <w:szCs w:val="20"/>
-        </w:rPr>
-        <w:t xml:space="preserve">Reflexiones:</w:t>
-      </w:r>
-      <w:r>
-        <w:rPr>
-          <w:rFonts w:ascii="Open Sans" w:hAnsi="Open Sans" w:eastAsia="Open Sans" w:cs="Open Sans"/>
-          <w:color w:val="000000"/>
-          <w:sz w:val="20"/>
-          <w:szCs w:val="20"/>
-        </w:rPr>
-        <w:t xml:space="preserve"> Dificultades encontradas durante el proceso, soluciones aplicadas y lecciones aprendidas, resaltando la importancia de cada etapa del pipeline.</w:t>
-      </w:r>
-      <w:r>
-        <w:rPr>
-          <w:rFonts w:ascii="Open Sans" w:hAnsi="Open Sans" w:eastAsia="Open Sans" w:cs="Open Sans"/>
-          <w:sz w:val="20"/>
-          <w:szCs w:val="20"/>
-        </w:rPr>
-      </w:r>
-    </w:p>
-    <w:p>
-      <w:pPr>
-        <w:pStyle w:val="664"/>
-        <w:numPr>
-          <w:ilvl w:val="0"/>
-          <w:numId w:val="10"/>
-        </w:numPr>
-        <w:pBdr>
-          <w:top w:val="none" w:color="000000" w:sz="4" w:space="0"/>
-          <w:left w:val="none" w:color="000000" w:sz="4" w:space="0"/>
-          <w:bottom w:val="none" w:color="000000" w:sz="4" w:space="0"/>
-          <w:right w:val="none" w:color="000000" w:sz="4" w:space="0"/>
-        </w:pBdr>
-        <w:spacing/>
-        <w:ind w:right="0"/>
-        <w:rPr>
-          <w:rFonts w:ascii="Open Sans" w:hAnsi="Open Sans" w:cs="Open Sans"/>
-          <w:sz w:val="20"/>
-          <w:szCs w:val="20"/>
-        </w:rPr>
-      </w:pPr>
-      <w:r>
-        <w:rPr>
-          <w:rFonts w:ascii="Open Sans" w:hAnsi="Open Sans" w:eastAsia="Open Sans" w:cs="Open Sans"/>
-          <w:b/>
-          <w:color w:val="000000"/>
-          <w:sz w:val="20"/>
-          <w:szCs w:val="20"/>
-        </w:rPr>
-        <w:t xml:space="preserve">Conclusiones:</w:t>
-      </w:r>
-      <w:r>
-        <w:rPr>
-          <w:rFonts w:ascii="Open Sans" w:hAnsi="Open Sans" w:eastAsia="Open Sans" w:cs="Open Sans"/>
-          <w:color w:val="000000"/>
-          <w:sz w:val="20"/>
-          <w:szCs w:val="20"/>
-        </w:rPr>
-        <w:t xml:space="preserve"> Resumen final del desempeño del modelo y las posibles direcciones para investigaciones o mejoras posteriores.</w:t>
-      </w:r>
-      <w:r>
-        <w:rPr>
-          <w:rFonts w:ascii="Open Sans" w:hAnsi="Open Sans" w:eastAsia="Open Sans" w:cs="Open Sans"/>
-          <w:sz w:val="20"/>
-          <w:szCs w:val="20"/>
-        </w:rPr>
-      </w:r>
-    </w:p>
-    <w:p>
-      <w:pPr>
-        <w:pBdr>
-          <w:top w:val="none" w:color="000000" w:sz="4" w:space="0"/>
-          <w:left w:val="none" w:color="000000" w:sz="4" w:space="0"/>
-          <w:bottom w:val="none" w:color="000000" w:sz="4" w:space="0"/>
-          <w:right w:val="none" w:color="000000" w:sz="4" w:space="0"/>
-        </w:pBdr>
-        <w:spacing/>
-        <w:ind w:right="0" w:firstLine="0" w:left="0"/>
-        <w:rPr>
-          <w:rFonts w:ascii="Open Sans" w:hAnsi="Open Sans" w:cs="Open Sans"/>
-          <w:sz w:val="20"/>
-          <w:szCs w:val="20"/>
-        </w:rPr>
-      </w:pPr>
-      <w:r>
-        <w:rPr>
-          <w:rFonts w:ascii="Open Sans" w:hAnsi="Open Sans" w:eastAsia="Open Sans" w:cs="Open Sans"/>
-          <w:color w:val="000000"/>
-          <w:sz w:val="20"/>
-          <w:szCs w:val="20"/>
-        </w:rPr>
-        <w:t xml:space="preserve">Este informe, redactado con un lenguaje sencillo, debería servir tanto para presentar los resultados del proyecto como para demostrar la metodología aplicada en cada paso, facilitando la comprensión del proceso a quienes no estén familiarizados con término</w:t>
-      </w:r>
-      <w:r>
-        <w:rPr>
-          <w:rFonts w:ascii="Open Sans" w:hAnsi="Open Sans" w:eastAsia="Open Sans" w:cs="Open Sans"/>
-          <w:color w:val="000000"/>
-          <w:sz w:val="20"/>
-          <w:szCs w:val="20"/>
-        </w:rPr>
-        <w:t xml:space="preserve">s muy técnicos.</w:t>
-      </w:r>
-      <w:r>
-        <w:rPr>
-          <w:rFonts w:ascii="Open Sans" w:hAnsi="Open Sans" w:eastAsia="Open Sans" w:cs="Open Sans"/>
-          <w:sz w:val="20"/>
-          <w:szCs w:val="20"/>
-        </w:rPr>
-      </w:r>
-    </w:p>
-    <w:p>
-      <w:pPr>
-        <w:pBdr>
-          <w:top w:val="none" w:color="000000" w:sz="4" w:space="0"/>
-          <w:left w:val="none" w:color="000000" w:sz="4" w:space="0"/>
-          <w:bottom w:val="none" w:color="000000" w:sz="4" w:space="0"/>
-          <w:right w:val="none" w:color="000000" w:sz="4" w:space="0"/>
-        </w:pBdr>
-        <w:spacing/>
-        <w:ind w:right="0" w:firstLine="0" w:left="0"/>
-        <w:rPr>
-          <w:rFonts w:ascii="Open Sans" w:hAnsi="Open Sans" w:cs="Open Sans"/>
-          <w:sz w:val="20"/>
-          <w:szCs w:val="20"/>
-        </w:rPr>
-      </w:pPr>
-      <w:r>
-        <w:rPr>
-          <w:rFonts w:ascii="Open Sans" w:hAnsi="Open Sans" w:eastAsia="Open Sans" w:cs="Open Sans"/>
-          <w:color w:val="000000"/>
-          <w:sz w:val="20"/>
-          <w:szCs w:val="20"/>
-        </w:rPr>
-        <w:t xml:space="preserve">Este es el reporte completo que abarca desde la carga de datos hasta la evaluación y análisis final de resultados. Si necesitas agregar o modificar algún detalle o requieres de gráficos adicionales, puedes complementar este informe con las visualizaciones </w:t>
-      </w:r>
-      <w:r>
-        <w:rPr>
-          <w:rFonts w:ascii="Open Sans" w:hAnsi="Open Sans" w:eastAsia="Open Sans" w:cs="Open Sans"/>
-          <w:color w:val="000000"/>
-          <w:sz w:val="20"/>
-          <w:szCs w:val="20"/>
-        </w:rPr>
-        <w:t xml:space="preserve">generadas durante el entrenamiento.</w:t>
-      </w:r>
-      <w:r>
-        <w:rPr>
-          <w:rFonts w:ascii="Open Sans" w:hAnsi="Open Sans" w:eastAsia="Open Sans" w:cs="Open Sans"/>
-          <w:sz w:val="20"/>
-          <w:szCs w:val="20"/>
-        </w:rPr>
-      </w:r>
-    </w:p>
-    <w:p>
-      <w:pPr>
-        <w:pBdr>
-          <w:top w:val="none" w:color="000000" w:sz="4" w:space="0"/>
-          <w:left w:val="none" w:color="000000" w:sz="4" w:space="0"/>
-          <w:bottom w:val="none" w:color="000000" w:sz="4" w:space="0"/>
-          <w:right w:val="none" w:color="000000" w:sz="4" w:space="0"/>
-        </w:pBdr>
-        <w:spacing/>
-        <w:ind w:right="0" w:firstLine="0" w:left="0"/>
-        <w:rPr>
-          <w:rFonts w:ascii="Open Sans" w:hAnsi="Open Sans" w:cs="Open Sans"/>
-          <w:sz w:val="20"/>
-          <w:szCs w:val="20"/>
-        </w:rPr>
-      </w:pPr>
-      <w:r>
-        <w:rPr>
-          <w:rFonts w:ascii="Open Sans" w:hAnsi="Open Sans" w:eastAsia="Open Sans" w:cs="Open Sans"/>
-          <w:color w:val="000000"/>
-          <w:sz w:val="20"/>
-          <w:szCs w:val="20"/>
-        </w:rPr>
-        <w:t xml:space="preserve">¿Hay algún aspecto en particular que desees ampliar o alguna otra pregunta respecto al proyecto?</w:t>
-      </w:r>
-      <w:r>
-        <w:rPr>
-          <w:rFonts w:ascii="Open Sans" w:hAnsi="Open Sans" w:eastAsia="Open Sans" w:cs="Open Sans"/>
-          <w:sz w:val="20"/>
-          <w:szCs w:val="20"/>
-        </w:rPr>
-      </w:r>
+        <w:pBdr/>
+        <w:spacing/>
+        <w:ind/>
+        <w:rPr/>
+      </w:pPr>
+      <w:r/>
+      <w:r/>
     </w:p>
     <w:p>
       <w:pPr>
@@ -4987,6 +5420,498 @@
     </w:lvl>
   </w:abstractNum>
   <w:abstractNum w:abstractNumId="9">
+    <w:lvl w:ilvl="0">
+      <w:isLgl w:val="false"/>
+      <w:lvlJc w:val="left"/>
+      <w:lvlText w:val="·"/>
+      <w:numFmt w:val="bullet"/>
+      <w:pPr>
+        <w:pBdr/>
+        <w:spacing/>
+        <w:ind w:hanging="360" w:left="709"/>
+      </w:pPr>
+      <w:rPr>
+        <w:rFonts w:hint="default" w:ascii="Symbol" w:hAnsi="Symbol" w:eastAsia="Symbol" w:cs="Symbol"/>
+        <w:color w:val="000000"/>
+        <w:sz w:val="24"/>
+      </w:rPr>
+      <w:start w:val="1"/>
+      <w:suff w:val="tab"/>
+    </w:lvl>
+    <w:lvl w:ilvl="1">
+      <w:isLgl w:val="false"/>
+      <w:lvlJc w:val="left"/>
+      <w:lvlText w:val="·"/>
+      <w:numFmt w:val="bullet"/>
+      <w:pPr>
+        <w:pBdr/>
+        <w:spacing/>
+        <w:ind w:hanging="360" w:left="1429"/>
+      </w:pPr>
+      <w:rPr>
+        <w:rFonts w:hint="default" w:ascii="Symbol" w:hAnsi="Symbol" w:eastAsia="Symbol" w:cs="Symbol"/>
+        <w:color w:val="000000"/>
+        <w:sz w:val="24"/>
+      </w:rPr>
+      <w:start w:val="1"/>
+      <w:suff w:val="tab"/>
+    </w:lvl>
+    <w:lvl w:ilvl="2">
+      <w:isLgl w:val="false"/>
+      <w:lvlJc w:val="left"/>
+      <w:lvlText w:val="·"/>
+      <w:numFmt w:val="bullet"/>
+      <w:pPr>
+        <w:pBdr/>
+        <w:spacing/>
+        <w:ind w:hanging="360" w:left="2149"/>
+      </w:pPr>
+      <w:rPr>
+        <w:rFonts w:hint="default" w:ascii="Symbol" w:hAnsi="Symbol" w:eastAsia="Symbol" w:cs="Symbol"/>
+        <w:color w:val="000000"/>
+        <w:sz w:val="24"/>
+      </w:rPr>
+      <w:start w:val="1"/>
+      <w:suff w:val="tab"/>
+    </w:lvl>
+    <w:lvl w:ilvl="3">
+      <w:isLgl w:val="false"/>
+      <w:lvlJc w:val="left"/>
+      <w:lvlText w:val="·"/>
+      <w:numFmt w:val="bullet"/>
+      <w:pPr>
+        <w:pBdr/>
+        <w:spacing/>
+        <w:ind w:hanging="360" w:left="2869"/>
+      </w:pPr>
+      <w:rPr>
+        <w:rFonts w:hint="default" w:ascii="Symbol" w:hAnsi="Symbol" w:eastAsia="Symbol" w:cs="Symbol"/>
+        <w:color w:val="000000"/>
+        <w:sz w:val="24"/>
+      </w:rPr>
+      <w:start w:val="1"/>
+      <w:suff w:val="tab"/>
+    </w:lvl>
+    <w:lvl w:ilvl="4">
+      <w:isLgl w:val="false"/>
+      <w:lvlJc w:val="left"/>
+      <w:lvlText w:val="·"/>
+      <w:numFmt w:val="bullet"/>
+      <w:pPr>
+        <w:pBdr/>
+        <w:spacing/>
+        <w:ind w:hanging="360" w:left="3589"/>
+      </w:pPr>
+      <w:rPr>
+        <w:rFonts w:hint="default" w:ascii="Symbol" w:hAnsi="Symbol" w:eastAsia="Symbol" w:cs="Symbol"/>
+        <w:color w:val="000000"/>
+        <w:sz w:val="24"/>
+      </w:rPr>
+      <w:start w:val="1"/>
+      <w:suff w:val="tab"/>
+    </w:lvl>
+    <w:lvl w:ilvl="5">
+      <w:isLgl w:val="false"/>
+      <w:lvlJc w:val="left"/>
+      <w:lvlText w:val="·"/>
+      <w:numFmt w:val="bullet"/>
+      <w:pPr>
+        <w:pBdr/>
+        <w:spacing/>
+        <w:ind w:hanging="360" w:left="4309"/>
+      </w:pPr>
+      <w:rPr>
+        <w:rFonts w:hint="default" w:ascii="Symbol" w:hAnsi="Symbol" w:eastAsia="Symbol" w:cs="Symbol"/>
+        <w:color w:val="000000"/>
+        <w:sz w:val="24"/>
+      </w:rPr>
+      <w:start w:val="1"/>
+      <w:suff w:val="tab"/>
+    </w:lvl>
+    <w:lvl w:ilvl="6">
+      <w:isLgl w:val="false"/>
+      <w:lvlJc w:val="left"/>
+      <w:lvlText w:val="·"/>
+      <w:numFmt w:val="bullet"/>
+      <w:pPr>
+        <w:pBdr/>
+        <w:spacing/>
+        <w:ind w:hanging="360" w:left="5029"/>
+      </w:pPr>
+      <w:rPr>
+        <w:rFonts w:hint="default" w:ascii="Symbol" w:hAnsi="Symbol" w:eastAsia="Symbol" w:cs="Symbol"/>
+        <w:color w:val="000000"/>
+        <w:sz w:val="24"/>
+      </w:rPr>
+      <w:start w:val="1"/>
+      <w:suff w:val="tab"/>
+    </w:lvl>
+    <w:lvl w:ilvl="7">
+      <w:isLgl w:val="false"/>
+      <w:lvlJc w:val="left"/>
+      <w:lvlText w:val="·"/>
+      <w:numFmt w:val="bullet"/>
+      <w:pPr>
+        <w:pBdr/>
+        <w:spacing/>
+        <w:ind w:hanging="360" w:left="5749"/>
+      </w:pPr>
+      <w:rPr>
+        <w:rFonts w:hint="default" w:ascii="Symbol" w:hAnsi="Symbol" w:eastAsia="Symbol" w:cs="Symbol"/>
+        <w:color w:val="000000"/>
+        <w:sz w:val="24"/>
+      </w:rPr>
+      <w:start w:val="1"/>
+      <w:suff w:val="tab"/>
+    </w:lvl>
+    <w:lvl w:ilvl="8">
+      <w:isLgl w:val="false"/>
+      <w:lvlJc w:val="left"/>
+      <w:lvlText w:val="·"/>
+      <w:numFmt w:val="bullet"/>
+      <w:pPr>
+        <w:pBdr/>
+        <w:spacing/>
+        <w:ind w:hanging="360" w:left="6469"/>
+      </w:pPr>
+      <w:rPr>
+        <w:rFonts w:hint="default" w:ascii="Symbol" w:hAnsi="Symbol" w:eastAsia="Symbol" w:cs="Symbol"/>
+        <w:color w:val="000000"/>
+        <w:sz w:val="24"/>
+      </w:rPr>
+      <w:start w:val="1"/>
+      <w:suff w:val="tab"/>
+    </w:lvl>
+  </w:abstractNum>
+  <w:abstractNum w:abstractNumId="10">
+    <w:lvl w:ilvl="0">
+      <w:isLgl w:val="false"/>
+      <w:lvlJc w:val="left"/>
+      <w:lvlText w:val="·"/>
+      <w:numFmt w:val="bullet"/>
+      <w:pPr>
+        <w:pBdr/>
+        <w:spacing/>
+        <w:ind w:hanging="360" w:left="709"/>
+      </w:pPr>
+      <w:rPr>
+        <w:rFonts w:hint="default" w:ascii="Symbol" w:hAnsi="Symbol" w:eastAsia="Symbol" w:cs="Symbol"/>
+        <w:color w:val="000000"/>
+        <w:sz w:val="20"/>
+      </w:rPr>
+      <w:start w:val="1"/>
+      <w:suff w:val="tab"/>
+    </w:lvl>
+    <w:lvl w:ilvl="1">
+      <w:isLgl w:val="false"/>
+      <w:lvlJc w:val="left"/>
+      <w:lvlText w:val="·"/>
+      <w:numFmt w:val="bullet"/>
+      <w:pPr>
+        <w:pBdr/>
+        <w:spacing/>
+        <w:ind w:hanging="360" w:left="1429"/>
+      </w:pPr>
+      <w:rPr>
+        <w:rFonts w:hint="default" w:ascii="Symbol" w:hAnsi="Symbol" w:eastAsia="Symbol" w:cs="Symbol"/>
+        <w:color w:val="000000"/>
+        <w:sz w:val="20"/>
+      </w:rPr>
+      <w:start w:val="1"/>
+      <w:suff w:val="tab"/>
+    </w:lvl>
+    <w:lvl w:ilvl="2">
+      <w:isLgl w:val="false"/>
+      <w:lvlJc w:val="left"/>
+      <w:lvlText w:val="·"/>
+      <w:numFmt w:val="bullet"/>
+      <w:pPr>
+        <w:pBdr/>
+        <w:spacing/>
+        <w:ind w:hanging="360" w:left="2149"/>
+      </w:pPr>
+      <w:rPr>
+        <w:rFonts w:hint="default" w:ascii="Symbol" w:hAnsi="Symbol" w:eastAsia="Symbol" w:cs="Symbol"/>
+        <w:color w:val="000000"/>
+        <w:sz w:val="20"/>
+      </w:rPr>
+      <w:start w:val="1"/>
+      <w:suff w:val="tab"/>
+    </w:lvl>
+    <w:lvl w:ilvl="3">
+      <w:isLgl w:val="false"/>
+      <w:lvlJc w:val="left"/>
+      <w:lvlText w:val="·"/>
+      <w:numFmt w:val="bullet"/>
+      <w:pPr>
+        <w:pBdr/>
+        <w:spacing/>
+        <w:ind w:hanging="360" w:left="2869"/>
+      </w:pPr>
+      <w:rPr>
+        <w:rFonts w:hint="default" w:ascii="Symbol" w:hAnsi="Symbol" w:eastAsia="Symbol" w:cs="Symbol"/>
+        <w:color w:val="000000"/>
+        <w:sz w:val="20"/>
+      </w:rPr>
+      <w:start w:val="1"/>
+      <w:suff w:val="tab"/>
+    </w:lvl>
+    <w:lvl w:ilvl="4">
+      <w:isLgl w:val="false"/>
+      <w:lvlJc w:val="left"/>
+      <w:lvlText w:val="·"/>
+      <w:numFmt w:val="bullet"/>
+      <w:pPr>
+        <w:pBdr/>
+        <w:spacing/>
+        <w:ind w:hanging="360" w:left="3589"/>
+      </w:pPr>
+      <w:rPr>
+        <w:rFonts w:hint="default" w:ascii="Symbol" w:hAnsi="Symbol" w:eastAsia="Symbol" w:cs="Symbol"/>
+        <w:color w:val="000000"/>
+        <w:sz w:val="20"/>
+      </w:rPr>
+      <w:start w:val="1"/>
+      <w:suff w:val="tab"/>
+    </w:lvl>
+    <w:lvl w:ilvl="5">
+      <w:isLgl w:val="false"/>
+      <w:lvlJc w:val="left"/>
+      <w:lvlText w:val="·"/>
+      <w:numFmt w:val="bullet"/>
+      <w:pPr>
+        <w:pBdr/>
+        <w:spacing/>
+        <w:ind w:hanging="360" w:left="4309"/>
+      </w:pPr>
+      <w:rPr>
+        <w:rFonts w:hint="default" w:ascii="Symbol" w:hAnsi="Symbol" w:eastAsia="Symbol" w:cs="Symbol"/>
+        <w:color w:val="000000"/>
+        <w:sz w:val="20"/>
+      </w:rPr>
+      <w:start w:val="1"/>
+      <w:suff w:val="tab"/>
+    </w:lvl>
+    <w:lvl w:ilvl="6">
+      <w:isLgl w:val="false"/>
+      <w:lvlJc w:val="left"/>
+      <w:lvlText w:val="·"/>
+      <w:numFmt w:val="bullet"/>
+      <w:pPr>
+        <w:pBdr/>
+        <w:spacing/>
+        <w:ind w:hanging="360" w:left="5029"/>
+      </w:pPr>
+      <w:rPr>
+        <w:rFonts w:hint="default" w:ascii="Symbol" w:hAnsi="Symbol" w:eastAsia="Symbol" w:cs="Symbol"/>
+        <w:color w:val="000000"/>
+        <w:sz w:val="20"/>
+      </w:rPr>
+      <w:start w:val="1"/>
+      <w:suff w:val="tab"/>
+    </w:lvl>
+    <w:lvl w:ilvl="7">
+      <w:isLgl w:val="false"/>
+      <w:lvlJc w:val="left"/>
+      <w:lvlText w:val="·"/>
+      <w:numFmt w:val="bullet"/>
+      <w:pPr>
+        <w:pBdr/>
+        <w:spacing/>
+        <w:ind w:hanging="360" w:left="5749"/>
+      </w:pPr>
+      <w:rPr>
+        <w:rFonts w:hint="default" w:ascii="Symbol" w:hAnsi="Symbol" w:eastAsia="Symbol" w:cs="Symbol"/>
+        <w:color w:val="000000"/>
+        <w:sz w:val="20"/>
+      </w:rPr>
+      <w:start w:val="1"/>
+      <w:suff w:val="tab"/>
+    </w:lvl>
+    <w:lvl w:ilvl="8">
+      <w:isLgl w:val="false"/>
+      <w:lvlJc w:val="left"/>
+      <w:lvlText w:val="·"/>
+      <w:numFmt w:val="bullet"/>
+      <w:pPr>
+        <w:pBdr/>
+        <w:spacing/>
+        <w:ind w:hanging="360" w:left="6469"/>
+      </w:pPr>
+      <w:rPr>
+        <w:rFonts w:hint="default" w:ascii="Symbol" w:hAnsi="Symbol" w:eastAsia="Symbol" w:cs="Symbol"/>
+        <w:color w:val="000000"/>
+        <w:sz w:val="20"/>
+      </w:rPr>
+      <w:start w:val="1"/>
+      <w:suff w:val="tab"/>
+    </w:lvl>
+  </w:abstractNum>
+  <w:abstractNum w:abstractNumId="11">
+    <w:lvl w:ilvl="0">
+      <w:isLgl w:val="false"/>
+      <w:lvlJc w:val="left"/>
+      <w:lvlText w:val="·"/>
+      <w:numFmt w:val="bullet"/>
+      <w:pPr>
+        <w:pBdr/>
+        <w:spacing/>
+        <w:ind w:hanging="360" w:left="709"/>
+      </w:pPr>
+      <w:rPr>
+        <w:rFonts w:hint="default" w:ascii="Symbol" w:hAnsi="Symbol" w:eastAsia="Symbol" w:cs="Symbol"/>
+        <w:color w:val="000000"/>
+        <w:sz w:val="20"/>
+      </w:rPr>
+      <w:start w:val="1"/>
+      <w:suff w:val="tab"/>
+    </w:lvl>
+    <w:lvl w:ilvl="1">
+      <w:isLgl w:val="false"/>
+      <w:lvlJc w:val="left"/>
+      <w:lvlText w:val="·"/>
+      <w:numFmt w:val="bullet"/>
+      <w:pPr>
+        <w:pBdr/>
+        <w:spacing/>
+        <w:ind w:hanging="360" w:left="1429"/>
+      </w:pPr>
+      <w:rPr>
+        <w:rFonts w:hint="default" w:ascii="Symbol" w:hAnsi="Symbol" w:eastAsia="Symbol" w:cs="Symbol"/>
+        <w:color w:val="000000"/>
+        <w:sz w:val="20"/>
+      </w:rPr>
+      <w:start w:val="1"/>
+      <w:suff w:val="tab"/>
+    </w:lvl>
+    <w:lvl w:ilvl="2">
+      <w:isLgl w:val="false"/>
+      <w:lvlJc w:val="left"/>
+      <w:lvlText w:val="·"/>
+      <w:numFmt w:val="bullet"/>
+      <w:pPr>
+        <w:pBdr/>
+        <w:spacing/>
+        <w:ind w:hanging="360" w:left="2149"/>
+      </w:pPr>
+      <w:rPr>
+        <w:rFonts w:hint="default" w:ascii="Symbol" w:hAnsi="Symbol" w:eastAsia="Symbol" w:cs="Symbol"/>
+        <w:color w:val="000000"/>
+        <w:sz w:val="20"/>
+      </w:rPr>
+      <w:start w:val="1"/>
+      <w:suff w:val="tab"/>
+    </w:lvl>
+    <w:lvl w:ilvl="3">
+      <w:isLgl w:val="false"/>
+      <w:lvlJc w:val="left"/>
+      <w:lvlText w:val="·"/>
+      <w:numFmt w:val="bullet"/>
+      <w:pPr>
+        <w:pBdr/>
+        <w:spacing/>
+        <w:ind w:hanging="360" w:left="2869"/>
+      </w:pPr>
+      <w:rPr>
+        <w:rFonts w:hint="default" w:ascii="Symbol" w:hAnsi="Symbol" w:eastAsia="Symbol" w:cs="Symbol"/>
+        <w:color w:val="000000"/>
+        <w:sz w:val="20"/>
+      </w:rPr>
+      <w:start w:val="1"/>
+      <w:suff w:val="tab"/>
+    </w:lvl>
+    <w:lvl w:ilvl="4">
+      <w:isLgl w:val="false"/>
+      <w:lvlJc w:val="left"/>
+      <w:lvlText w:val="·"/>
+      <w:numFmt w:val="bullet"/>
+      <w:pPr>
+        <w:pBdr/>
+        <w:spacing/>
+        <w:ind w:hanging="360" w:left="3589"/>
+      </w:pPr>
+      <w:rPr>
+        <w:rFonts w:hint="default" w:ascii="Symbol" w:hAnsi="Symbol" w:eastAsia="Symbol" w:cs="Symbol"/>
+        <w:color w:val="000000"/>
+        <w:sz w:val="20"/>
+      </w:rPr>
+      <w:start w:val="1"/>
+      <w:suff w:val="tab"/>
+    </w:lvl>
+    <w:lvl w:ilvl="5">
+      <w:isLgl w:val="false"/>
+      <w:lvlJc w:val="left"/>
+      <w:lvlText w:val="·"/>
+      <w:numFmt w:val="bullet"/>
+      <w:pPr>
+        <w:pBdr/>
+        <w:spacing/>
+        <w:ind w:hanging="360" w:left="4309"/>
+      </w:pPr>
+      <w:rPr>
+        <w:rFonts w:hint="default" w:ascii="Symbol" w:hAnsi="Symbol" w:eastAsia="Symbol" w:cs="Symbol"/>
+        <w:color w:val="000000"/>
+        <w:sz w:val="20"/>
+      </w:rPr>
+      <w:start w:val="1"/>
+      <w:suff w:val="tab"/>
+    </w:lvl>
+    <w:lvl w:ilvl="6">
+      <w:isLgl w:val="false"/>
+      <w:lvlJc w:val="left"/>
+      <w:lvlText w:val="·"/>
+      <w:numFmt w:val="bullet"/>
+      <w:pPr>
+        <w:pBdr/>
+        <w:spacing/>
+        <w:ind w:hanging="360" w:left="5029"/>
+      </w:pPr>
+      <w:rPr>
+        <w:rFonts w:hint="default" w:ascii="Symbol" w:hAnsi="Symbol" w:eastAsia="Symbol" w:cs="Symbol"/>
+        <w:color w:val="000000"/>
+        <w:sz w:val="20"/>
+      </w:rPr>
+      <w:start w:val="1"/>
+      <w:suff w:val="tab"/>
+    </w:lvl>
+    <w:lvl w:ilvl="7">
+      <w:isLgl w:val="false"/>
+      <w:lvlJc w:val="left"/>
+      <w:lvlText w:val="·"/>
+      <w:numFmt w:val="bullet"/>
+      <w:pPr>
+        <w:pBdr/>
+        <w:spacing/>
+        <w:ind w:hanging="360" w:left="5749"/>
+      </w:pPr>
+      <w:rPr>
+        <w:rFonts w:hint="default" w:ascii="Symbol" w:hAnsi="Symbol" w:eastAsia="Symbol" w:cs="Symbol"/>
+        <w:color w:val="000000"/>
+        <w:sz w:val="20"/>
+      </w:rPr>
+      <w:start w:val="1"/>
+      <w:suff w:val="tab"/>
+    </w:lvl>
+    <w:lvl w:ilvl="8">
+      <w:isLgl w:val="false"/>
+      <w:lvlJc w:val="left"/>
+      <w:lvlText w:val="·"/>
+      <w:numFmt w:val="bullet"/>
+      <w:pPr>
+        <w:pBdr/>
+        <w:spacing/>
+        <w:ind w:hanging="360" w:left="6469"/>
+      </w:pPr>
+      <w:rPr>
+        <w:rFonts w:hint="default" w:ascii="Symbol" w:hAnsi="Symbol" w:eastAsia="Symbol" w:cs="Symbol"/>
+        <w:color w:val="000000"/>
+        <w:sz w:val="20"/>
+      </w:rPr>
+      <w:start w:val="1"/>
+      <w:suff w:val="tab"/>
+    </w:lvl>
+  </w:abstractNum>
+  <w:abstractNum w:abstractNumId="12">
     <w:lvl w:ilvl="0">
       <w:isLgl w:val="false"/>
       <w:lvlJc w:val="left"/>
@@ -5179,6 +6104,15 @@
   </w:num>
   <w:num w:numId="10">
     <w:abstractNumId w:val="9"/>
+  </w:num>
+  <w:num w:numId="11">
+    <w:abstractNumId w:val="10"/>
+  </w:num>
+  <w:num w:numId="12">
+    <w:abstractNumId w:val="11"/>
+  </w:num>
+  <w:num w:numId="13">
+    <w:abstractNumId w:val="12"/>
   </w:num>
 </w:numbering>
 </file>

</xml_diff>